<commit_message>
Live demo: strip Google 'models/' prefix (OpenAI-compat chat 404s on it)
Google's /models endpoint lists ids as 'models/gemini-…', but its OpenAI-
compatible chat endpoint wants the bare 'gemini-…' and 404s on the prefixed
form. A model picked from the ⤓ loader therefore failed. Strip the 'models/'
prefix in two places: the model-list loader (so the picker offers clean ids)
and apply_overlay for Google tiers (so an already-saved prefixed value is
auto-corrected on Apply).
</commit_message>
<xml_diff>
--- a/semantic_router_whitepaper.docx
+++ b/semantic_router_whitepaper.docx
@@ -205,7 +205,7 @@
         <w:t xml:space="preserve">39 percent cost reduction</w:t>
       </w:r>
       <w:r>
-        <w:t xml:space="preserve"> against an all-frontier baseline on the benchmark mix, which deliberately over-weights hard queries.</w:t>
+        <w:t xml:space="preserve"> against an all-frontier baseline on an even query distribution, the balanced mix the benchmark uses to test the router across every difficulty band.</w:t>
       </w:r>
     </w:p>
     <w:p>
@@ -225,7 +225,7 @@
         <w:t xml:space="preserve">Roughly 86 percent cost reduction</w:t>
       </w:r>
       <w:r>
-        <w:t xml:space="preserve"> when the same per-tier economics are projected onto a realistic production traffic mix, where most queries are easy.</w:t>
+        <w:t xml:space="preserve"> on a simple-weighted distribution, the same per-tier costs applied to the easy-heavy traffic most production deployments actually see.</w:t>
       </w:r>
     </w:p>
     <w:p>
@@ -258,7 +258,7 @@
           <wp:inline distT="0" distB="0" distL="0" distR="0">
             <wp:extent cx="5715000" cy="3048000"/>
             <wp:effectExtent t="0" r="0" b="0" l="0"/>
-            <wp:docPr id="1" name="fig_cost_savings.png" descr="Figure 1. Cost to serve the same 797-query workload three ways. Numbers are dollars per one million queries at the measured token counts and current supplier rates." title="Figure 1. Cost to serve the same 797-query workload three ways. Numbers are dollars per one million queries at the measured token counts and current supplier rates."/>
+            <wp:docPr id="1" name="fig_cost_savings.png" descr="Figure 1. Cost to serve the same workload three ways: every query to the frontier model, routed over an even query distribution, and routed over a simple-weighted distribution. Numbers are dollars per one million queries at the measured token counts and current supplier rates. The two distributions are explained in Section 7.3." title="Figure 1. Cost to serve the same workload three ways: every query to the frontier model, routed over an even query distribution, and routed over a simple-weighted distribution. Numbers are dollars per one million queries at the measured token counts and current supplier rates. The two distributions are explained in Section 7.3."/>
             <wp:cNvGraphicFramePr>
               <a:graphicFrameLocks xmlns:a="http://schemas.openxmlformats.org/drawingml/2006/main" noChangeAspect="1"/>
             </wp:cNvGraphicFramePr>
@@ -307,7 +307,7 @@
           <w:sz w:val="18"/>
           <w:szCs w:val="18"/>
         </w:rPr>
-        <w:t xml:space="preserve">Figure 1. Cost to serve the same 797-query workload three ways. Numbers are dollars per one million queries at the measured token counts and current supplier rates.</w:t>
+        <w:t xml:space="preserve">Figure 1. Cost to serve the same workload three ways: every query to the frontier model, routed over an even query distribution, and routed over a simple-weighted distribution. Numbers are dollars per one million queries at the measured token counts and current supplier rates. The two distributions are explained in Section 7.3.</w:t>
       </w:r>
     </w:p>
     <w:p>
@@ -342,7 +342,7 @@
         <w:jc w:val="both"/>
       </w:pPr>
       <w:r>
-        <w:t xml:space="preserve">To make the scale concrete, consider one million queries drawn from the benchmark mix. Answered entirely by a frontier model, they cost about </w:t>
+        <w:t xml:space="preserve">To make the scale concrete, consider one million queries. Answered entirely by a frontier model, they cost about </w:t>
       </w:r>
       <w:r>
         <w:rPr>
@@ -352,7 +352,7 @@
         <w:t xml:space="preserve">$7,192</w:t>
       </w:r>
       <w:r>
-        <w:t xml:space="preserve"> at the token counts we measured. The same workload, routed across cloud models, costs about </w:t>
+        <w:t xml:space="preserve"> at the token counts we measured. Routed across cloud models over an even query distribution, the same workload costs about </w:t>
       </w:r>
       <w:r>
         <w:rPr>
@@ -362,7 +362,7 @@
         <w:t xml:space="preserve">$4,364</w:t>
       </w:r>
       <w:r>
-        <w:t xml:space="preserve">. On a production traffic mix weighted toward easy questions, the routed cost falls to roughly </w:t>
+        <w:t xml:space="preserve">. Over a simple-weighted distribution, the easy-heavy traffic typical of real deployments, the routed cost falls to roughly </w:t>
       </w:r>
       <w:r>
         <w:rPr>
@@ -372,7 +372,7 @@
         <w:t xml:space="preserve">$1,024</w:t>
       </w:r>
       <w:r>
-        <w:t xml:space="preserve">. At enterprise volume, where a busy assistant can field tens of millions of queries per month, the difference compounds into six and seven figure annual sums.</w:t>
+        <w:t xml:space="preserve">. At enterprise volume, where a busy assistant can field tens of millions of queries per month, the difference compounds into six and seven figure annual sums. Both distributions are defined in Section 7.3.</w:t>
       </w:r>
     </w:p>
     <w:p>
@@ -2409,27 +2409,68 @@
         <w:jc w:val="both"/>
       </w:pPr>
       <w:r>
-        <w:t xml:space="preserve">On the benchmark mix, routing across cloud models cut cost against an all-frontier baseline by </w:t>
-      </w:r>
+        <w:t xml:space="preserve">Cost depends on two things: the per-query cost measured at each tier, and how query traffic is distributed across the tiers. The per-tier costs below are measured directly from the run. The distribution is a property of the workload, so we report cost under two distributions, both applied to the same measured per-tier costs.</w:t>
+      </w:r>
+    </w:p>
+    <w:p>
+      <w:pPr>
+        <w:spacing w:after="160" w:line="276"/>
+        <w:jc w:val="both"/>
+      </w:pPr>
       <w:r>
         <w:rPr>
           <w:b/>
           <w:bCs/>
         </w:rPr>
-        <w:t xml:space="preserve">39 percent</w:t>
-      </w:r>
-      <w:r>
-        <w:t xml:space="preserve">, from about $7,192 to about $4,364 per million queries. That figure is conservative because the benchmark over-weights hard queries. Re-weighting the same measured per-tier costs onto a realistic production mix, where roughly six in ten queries are trivial, brings routed cost to about $1,024 per million, an </w:t>
+        <w:t xml:space="preserve">Even query distribution. </w:t>
+      </w:r>
+      <w:r>
+        <w:t xml:space="preserve">The benchmark spreads its 797 queries almost evenly across the five difficulty bands, roughly 20 percent in each, so that the router is tested across the full range. Under this distribution, routing across cloud models cut cost against the all-frontier baseline by </w:t>
       </w:r>
       <w:r>
         <w:rPr>
           <w:b/>
           <w:bCs/>
         </w:rPr>
+        <w:t xml:space="preserve">39 percent</w:t>
+      </w:r>
+      <w:r>
+        <w:t xml:space="preserve">, from about $7,192 to about $4,364 per million queries. This is a conservative figure, because an even spread sends far more traffic to the expensive upper tiers than real usage does.</w:t>
+      </w:r>
+    </w:p>
+    <w:p>
+      <w:pPr>
+        <w:spacing w:after="160" w:line="276"/>
+        <w:jc w:val="both"/>
+      </w:pPr>
+      <w:r>
+        <w:rPr>
+          <w:b/>
+          <w:bCs/>
+        </w:rPr>
+        <w:t xml:space="preserve">Simple-weighted distribution. </w:t>
+      </w:r>
+      <w:r>
+        <w:t xml:space="preserve">Production traffic is rarely even. The large majority of real questions are simple lookups, conversions, and short tasks, with only a thin tail of frontier-grade work, so deployments skew heavily toward the lower tiers. To show cost under that reality, we re-weight the same measured per-tier costs to a representative easy-heavy split of 60, 20, 12, 5, and 3 percent across tiers T1 to T5. Under this distribution the routed cost falls to about $1,024 per million, an </w:t>
+      </w:r>
+      <w:r>
+        <w:rPr>
+          <w:b/>
+          <w:bCs/>
+        </w:rPr>
         <w:t xml:space="preserve">86 percent reduction</w:t>
       </w:r>
       <w:r>
-        <w:t xml:space="preserve">. The routing decision itself was cheap: mean routing latency was </w:t>
+        <w:t xml:space="preserve">. The 60/20/12/5/3 split is an illustrative estimate of typical production traffic, not a measurement of any specific deployment; an operator with their own traffic profile can substitute it and recompute.</w:t>
+      </w:r>
+    </w:p>
+    <w:p>
+      <w:pPr>
+        <w:spacing w:after="160" w:line="276"/>
+        <w:jc w:val="both"/>
+      </w:pPr>
+      <w:r>
+        <w:t xml:space="preserve">The routing decision itself was cheap under either distribution: mean routing latency was </w:t>
       </w:r>
       <w:r>
         <w:rPr>
@@ -3012,7 +3053,7 @@
                 <w:sz w:val="20"/>
                 <w:szCs w:val="20"/>
               </w:rPr>
-              <w:t xml:space="preserve">Cost reduction, benchmark mix</w:t>
+              <w:t xml:space="preserve">Cost reduction, even distribution</w:t>
             </w:r>
           </w:p>
         </w:tc>
@@ -3078,7 +3119,7 @@
                 <w:sz w:val="20"/>
                 <w:szCs w:val="20"/>
               </w:rPr>
-              <w:t xml:space="preserve">vs all-frontier baseline</w:t>
+              <w:t xml:space="preserve">Measured benchmark traffic</w:t>
             </w:r>
           </w:p>
         </w:tc>
@@ -3116,7 +3157,7 @@
                 <w:sz w:val="20"/>
                 <w:szCs w:val="20"/>
               </w:rPr>
-              <w:t xml:space="preserve">Cost reduction, production mix</w:t>
+              <w:t xml:space="preserve">Cost reduction, simple-weighted</w:t>
             </w:r>
           </w:p>
         </w:tc>
@@ -3182,7 +3223,7 @@
                 <w:sz w:val="20"/>
                 <w:szCs w:val="20"/>
               </w:rPr>
-              <w:t xml:space="preserve">Re-weighted per-tier costs</w:t>
+              <w:t xml:space="preserve">Easy-heavy production estimate</w:t>
             </w:r>
           </w:p>
         </w:tc>
@@ -3415,7 +3456,7 @@
         <w:jc w:val="both"/>
       </w:pPr>
       <w:r>
-        <w:t xml:space="preserve">A semantic router earns its place by matching the cost of answering a question to the difficulty of the question. On the benchmark documented here, routing entirely across cloud models sent 98 percent of traffic to a tier whose answer independent judges accepted, while cutting blended cost by 39 percent on a hard-weighted benchmark and by roughly 86 percent on a realistic production mix. The two cheapest tiers, which carry most production traffic, bind to the smallest hosted models at a small fraction of frontier rates, and the routing decision adds only about a third of a second. The savings come from the large, confidently-easy majority of real traffic, and they do not require giving up the frontier model on the questions that need it.</w:t>
+        <w:t xml:space="preserve">A semantic router earns its place by matching the cost of answering a question to the difficulty of the question. On the benchmark documented here, routing entirely across cloud models sent 98 percent of traffic to a tier whose answer independent judges accepted, while cutting blended cost by 39 percent on an even query distribution and by roughly 86 percent on the simple-weighted distribution typical of production traffic. The two cheapest tiers, which carry most production traffic, bind to the smallest hosted models at a small fraction of frontier rates, and the routing decision adds only about a third of a second. The savings come from the large, confidently-easy majority of real traffic, and they do not require giving up the frontier model on the questions that need it.</w:t>
       </w:r>
     </w:p>
     <w:p>
@@ -4352,7 +4393,7 @@
       <w:r>
         <w:t xml:space="preserve">RouteLLM: Learning to Route LLMs with Preference Data (Ong et al., 2024). </w:t>
       </w:r>
-      <w:hyperlink w:history="1" r:id="rId9buubxnim1ndweozw9nro">
+      <w:hyperlink w:history="1" r:id="rIdam9ouq8ksftx-bf00uehn">
         <w:r>
           <w:rPr>
             <w:rStyle w:val="Hyperlink"/>
@@ -4375,7 +4416,7 @@
       <w:r>
         <w:t xml:space="preserve">RouteLLM: An Open-Source Framework for Cost-Effective LLM Routing, LMSYS Blog (2024). </w:t>
       </w:r>
-      <w:hyperlink w:history="1" r:id="rIdecb7fubwkxvnaqba_jzyp">
+      <w:hyperlink w:history="1" r:id="rIdgjldnlf6vmerqy69tnjh3">
         <w:r>
           <w:rPr>
             <w:rStyle w:val="Hyperlink"/>
@@ -4398,7 +4439,7 @@
       <w:r>
         <w:t xml:space="preserve">Bringing intelligent, efficient routing to open source AI with vLLM Semantic Router, Red Hat (2025). </w:t>
       </w:r>
-      <w:hyperlink w:history="1" r:id="rIdlrwlfx_pkh4o47uxlnjj5">
+      <w:hyperlink w:history="1" r:id="rIdptv06ftwfncylgnjnktdj">
         <w:r>
           <w:rPr>
             <w:rStyle w:val="Hyperlink"/>
@@ -4421,7 +4462,7 @@
       <w:r>
         <w:t xml:space="preserve">vLLM Semantic Router: Next Phase in LLM inference, vLLM Blog (2025). </w:t>
       </w:r>
-      <w:hyperlink w:history="1" r:id="rIdgavrz1-rnts1n-wjwk-st">
+      <w:hyperlink w:history="1" r:id="rIdqjddscdsmam4qepkiaa-u">
         <w:r>
           <w:rPr>
             <w:rStyle w:val="Hyperlink"/>
@@ -4444,7 +4485,7 @@
       <w:r>
         <w:t xml:space="preserve">When to Reason: Semantic Router for vLLM (2025). </w:t>
       </w:r>
-      <w:hyperlink w:history="1" r:id="rId7qcd9i60fyfpqz2t4mmzm">
+      <w:hyperlink w:history="1" r:id="rIdtwzfccggc7ual5bb4wtae">
         <w:r>
           <w:rPr>
             <w:rStyle w:val="Hyperlink"/>
@@ -4467,7 +4508,7 @@
       <w:r>
         <w:t xml:space="preserve">Building an LLM Router for High-Quality and Cost-Effective Responses, Anyscale. </w:t>
       </w:r>
-      <w:hyperlink w:history="1" r:id="rIdhx0d59t7f9o5yjilrpgxc">
+      <w:hyperlink w:history="1" r:id="rIdm3mpnykxwq3g5ru0wsgax">
         <w:r>
           <w:rPr>
             <w:rStyle w:val="Hyperlink"/>
@@ -4493,7 +4534,7 @@
           <w:sz w:val="18"/>
           <w:szCs w:val="18"/>
         </w:rPr>
-        <w:t xml:space="preserve">Benchmark figures are computed from the project exports (demo_data.json, routed_queries_with_answers.json, evaluations.json) and supplier pricing in pricing.json. Cost projections use measured token counts at current published per-million-token rates; the production-mix projection re-weights measured per-tier costs to an illustrative 60/20/12/5/3 distribution across tiers T1 through T5.</w:t>
+        <w:t xml:space="preserve">Benchmark figures are computed from the project exports (demo_data.json, routed_queries_with_answers.json, evaluations.json) and supplier pricing in pricing.json. Cost figures use measured token counts at current published per-million-token rates. The even-distribution figure reflects the benchmark traffic directly; the simple-weighted figure re-weights the same measured per-tier costs to an illustrative 60/20/12/5/3 distribution across tiers T1 through T5, representing easy-heavy production traffic.</w:t>
       </w:r>
     </w:p>
     <w:sectPr>

</xml_diff>

<commit_message>
Model picker: filter out non-chat models from the ⤓ list
A provider's /models lists every resource, not just chat ones — Google's
includes embeddings, TTS, image, native-audio, live, robotics, and
computer-use models that /chat/completions 404s on; OpenAI's includes
text-embedding-*, tts-*, whisper, dall-e. The ⤓ loader now filters those out
(substring blocklist) so the dropdown only offers chat-capable models, with a
fallback to the unfiltered list if the filter would empty it. Verified against
the real Google list: keeps gemini-*-flash/pro/etc., drops *-tts/-image/
-audio/-live/embedding/robotics/computer-use.
</commit_message>
<xml_diff>
--- a/semantic_router_whitepaper.docx
+++ b/semantic_router_whitepaper.docx
@@ -772,6 +772,7 @@
       </w:tblGrid>
       <w:tr>
         <w:trPr>
+          <w:cantSplit/>
           <w:tblHeader/>
         </w:trPr>
         <w:tc>
@@ -876,6 +877,7 @@
       </w:tr>
       <w:tr>
         <w:trPr>
+          <w:cantSplit/>
           <w:tblHeader w:val="false"/>
         </w:trPr>
         <w:tc>
@@ -980,6 +982,7 @@
       </w:tr>
       <w:tr>
         <w:trPr>
+          <w:cantSplit/>
           <w:tblHeader w:val="false"/>
         </w:trPr>
         <w:tc>
@@ -1084,6 +1087,7 @@
       </w:tr>
       <w:tr>
         <w:trPr>
+          <w:cantSplit/>
           <w:tblHeader w:val="false"/>
         </w:trPr>
         <w:tc>
@@ -1188,6 +1192,7 @@
       </w:tr>
       <w:tr>
         <w:trPr>
+          <w:cantSplit/>
           <w:tblHeader w:val="false"/>
         </w:trPr>
         <w:tc>
@@ -1292,6 +1297,7 @@
       </w:tr>
       <w:tr>
         <w:trPr>
+          <w:cantSplit/>
           <w:tblHeader w:val="false"/>
         </w:trPr>
         <w:tc>
@@ -1474,7 +1480,7 @@
         <w:pStyle w:val="Heading2"/>
       </w:pPr>
       <w:r>
-        <w:t xml:space="preserve">5.3 Write the exemplars</w:t>
+        <w:t xml:space="preserve">5.3 The signal categories, and what is fixed versus what you choose</w:t>
       </w:r>
     </w:p>
     <w:p>
@@ -1483,7 +1489,7 @@
         <w:jc w:val="both"/>
       </w:pPr>
       <w:r>
-        <w:t xml:space="preserve">Exemplars are the worked examples the router learns difficulty from. They are grouped into signal banks. A complexity signal holds a hard bank and an easy bank; the classifier reports the margin by which a prompt resembles hard examples more than easy ones. Embedding signals hold a single bank each and contribute in proportion to how closely a prompt matches it.</w:t>
+        <w:t xml:space="preserve">This is the part that looks like magic, and it is worth slowing down on, because it is not magic at all. The router never decides a tier directly. For each prompt it computes a single number, called request_difficulty, then compares that number to a set of cutoffs to pick the band. Everything else is bookkeeping. The number is a weighted sum of signals, and a signal is just a measurement of the prompt that you have decided is evidence of difficulty.</w:t>
       </w:r>
     </w:p>
     <w:p>
@@ -1492,579 +1498,7 @@
         <w:jc w:val="both"/>
       </w:pPr>
       <w:r>
-        <w:t xml:space="preserve">The configuration used here carries one complexity signal and four embedding signals. The complexity signal contrasts diverse hard archetypes, such as multi-step proofs, deep domain questions, and open-ended judgment, against diverse trivial archetypes, such as factual lookups and simple definitions. The four embedding signals each capture a specific pattern:</w:t>
-      </w:r>
-    </w:p>
-    <w:tbl>
-      <w:tblPr>
-        <w:tblW w:type="dxa" w:w="9360"/>
-        <w:tblBorders>
-          <w:top w:val="single" w:color="auto" w:sz="4"/>
-          <w:left w:val="single" w:color="auto" w:sz="4"/>
-          <w:bottom w:val="single" w:color="auto" w:sz="4"/>
-          <w:right w:val="single" w:color="auto" w:sz="4"/>
-          <w:insideH w:val="single" w:color="auto" w:sz="4"/>
-          <w:insideV w:val="single" w:color="auto" w:sz="4"/>
-        </w:tblBorders>
-      </w:tblPr>
-      <w:tblGrid>
-        <w:gridCol w:w="2900"/>
-        <w:gridCol w:w="1300"/>
-        <w:gridCol w:w="5160"/>
-      </w:tblGrid>
-      <w:tr>
-        <w:trPr>
-          <w:tblHeader/>
-        </w:trPr>
-        <w:tc>
-          <w:tcPr>
-            <w:tcW w:type="dxa" w:w="2900"/>
-            <w:tcBorders>
-              <w:top w:val="single" w:color="CCCCCC" w:sz="1"/>
-              <w:left w:val="single" w:color="CCCCCC" w:sz="1"/>
-              <w:bottom w:val="single" w:color="CCCCCC" w:sz="1"/>
-              <w:right w:val="single" w:color="CCCCCC" w:sz="1"/>
-            </w:tcBorders>
-            <w:shd w:fill="d5e8f0" w:val="clear"/>
-            <w:tcMar>
-              <w:top w:type="dxa" w:w="80"/>
-              <w:left w:type="dxa" w:w="120"/>
-              <w:bottom w:type="dxa" w:w="80"/>
-              <w:right w:type="dxa" w:w="120"/>
-            </w:tcMar>
-            <w:vAlign w:val="center"/>
-          </w:tcPr>
-          <w:p>
-            <w:pPr>
-              <w:jc w:val="left"/>
-            </w:pPr>
-            <w:r>
-              <w:rPr>
-                <w:b/>
-                <w:bCs/>
-                <w:sz w:val="20"/>
-                <w:szCs w:val="20"/>
-              </w:rPr>
-              <w:t xml:space="preserve">Signal</w:t>
-            </w:r>
-          </w:p>
-        </w:tc>
-        <w:tc>
-          <w:tcPr>
-            <w:tcW w:type="dxa" w:w="1300"/>
-            <w:tcBorders>
-              <w:top w:val="single" w:color="CCCCCC" w:sz="1"/>
-              <w:left w:val="single" w:color="CCCCCC" w:sz="1"/>
-              <w:bottom w:val="single" w:color="CCCCCC" w:sz="1"/>
-              <w:right w:val="single" w:color="CCCCCC" w:sz="1"/>
-            </w:tcBorders>
-            <w:shd w:fill="d5e8f0" w:val="clear"/>
-            <w:tcMar>
-              <w:top w:type="dxa" w:w="80"/>
-              <w:left w:type="dxa" w:w="120"/>
-              <w:bottom w:type="dxa" w:w="80"/>
-              <w:right w:type="dxa" w:w="120"/>
-            </w:tcMar>
-            <w:vAlign w:val="center"/>
-          </w:tcPr>
-          <w:p>
-            <w:pPr>
-              <w:jc w:val="center"/>
-            </w:pPr>
-            <w:r>
-              <w:rPr>
-                <w:b/>
-                <w:bCs/>
-                <w:sz w:val="20"/>
-                <w:szCs w:val="20"/>
-              </w:rPr>
-              <w:t xml:space="preserve">Weight</w:t>
-            </w:r>
-          </w:p>
-        </w:tc>
-        <w:tc>
-          <w:tcPr>
-            <w:tcW w:type="dxa" w:w="5160"/>
-            <w:tcBorders>
-              <w:top w:val="single" w:color="CCCCCC" w:sz="1"/>
-              <w:left w:val="single" w:color="CCCCCC" w:sz="1"/>
-              <w:bottom w:val="single" w:color="CCCCCC" w:sz="1"/>
-              <w:right w:val="single" w:color="CCCCCC" w:sz="1"/>
-            </w:tcBorders>
-            <w:shd w:fill="d5e8f0" w:val="clear"/>
-            <w:tcMar>
-              <w:top w:type="dxa" w:w="80"/>
-              <w:left w:type="dxa" w:w="120"/>
-              <w:bottom w:type="dxa" w:w="80"/>
-              <w:right w:type="dxa" w:w="120"/>
-            </w:tcMar>
-            <w:vAlign w:val="center"/>
-          </w:tcPr>
-          <w:p>
-            <w:pPr>
-              <w:jc w:val="center"/>
-            </w:pPr>
-            <w:r>
-              <w:rPr>
-                <w:b/>
-                <w:bCs/>
-                <w:sz w:val="20"/>
-                <w:szCs w:val="20"/>
-              </w:rPr>
-              <w:t xml:space="preserve">What it captures</w:t>
-            </w:r>
-          </w:p>
-        </w:tc>
-      </w:tr>
-      <w:tr>
-        <w:trPr>
-          <w:tblHeader w:val="false"/>
-        </w:trPr>
-        <w:tc>
-          <w:tcPr>
-            <w:tcW w:type="dxa" w:w="2900"/>
-            <w:tcBorders>
-              <w:top w:val="single" w:color="CCCCCC" w:sz="1"/>
-              <w:left w:val="single" w:color="CCCCCC" w:sz="1"/>
-              <w:bottom w:val="single" w:color="CCCCCC" w:sz="1"/>
-              <w:right w:val="single" w:color="CCCCCC" w:sz="1"/>
-            </w:tcBorders>
-            <w:shd w:fill="FFFFFF" w:val="clear"/>
-            <w:tcMar>
-              <w:top w:type="dxa" w:w="80"/>
-              <w:left w:type="dxa" w:w="120"/>
-              <w:bottom w:type="dxa" w:w="80"/>
-              <w:right w:type="dxa" w:w="120"/>
-            </w:tcMar>
-            <w:vAlign w:val="center"/>
-          </w:tcPr>
-          <w:p>
-            <w:pPr>
-              <w:jc w:val="left"/>
-            </w:pPr>
-            <w:r>
-              <w:rPr>
-                <w:b w:val="false"/>
-                <w:bCs w:val="false"/>
-                <w:sz w:val="20"/>
-                <w:szCs w:val="20"/>
-              </w:rPr>
-              <w:t xml:space="preserve">trivial_lookup</w:t>
-            </w:r>
-          </w:p>
-        </w:tc>
-        <w:tc>
-          <w:tcPr>
-            <w:tcW w:type="dxa" w:w="1300"/>
-            <w:tcBorders>
-              <w:top w:val="single" w:color="CCCCCC" w:sz="1"/>
-              <w:left w:val="single" w:color="CCCCCC" w:sz="1"/>
-              <w:bottom w:val="single" w:color="CCCCCC" w:sz="1"/>
-              <w:right w:val="single" w:color="CCCCCC" w:sz="1"/>
-            </w:tcBorders>
-            <w:shd w:fill="FFFFFF" w:val="clear"/>
-            <w:tcMar>
-              <w:top w:type="dxa" w:w="80"/>
-              <w:left w:type="dxa" w:w="120"/>
-              <w:bottom w:type="dxa" w:w="80"/>
-              <w:right w:type="dxa" w:w="120"/>
-            </w:tcMar>
-            <w:vAlign w:val="center"/>
-          </w:tcPr>
-          <w:p>
-            <w:pPr>
-              <w:jc w:val="center"/>
-            </w:pPr>
-            <w:r>
-              <w:rPr>
-                <w:b w:val="false"/>
-                <w:bCs w:val="false"/>
-                <w:sz w:val="20"/>
-                <w:szCs w:val="20"/>
-              </w:rPr>
-              <w:t xml:space="preserve">-0.20</w:t>
-            </w:r>
-          </w:p>
-        </w:tc>
-        <w:tc>
-          <w:tcPr>
-            <w:tcW w:type="dxa" w:w="5160"/>
-            <w:tcBorders>
-              <w:top w:val="single" w:color="CCCCCC" w:sz="1"/>
-              <w:left w:val="single" w:color="CCCCCC" w:sz="1"/>
-              <w:bottom w:val="single" w:color="CCCCCC" w:sz="1"/>
-              <w:right w:val="single" w:color="CCCCCC" w:sz="1"/>
-            </w:tcBorders>
-            <w:shd w:fill="FFFFFF" w:val="clear"/>
-            <w:tcMar>
-              <w:top w:type="dxa" w:w="80"/>
-              <w:left w:type="dxa" w:w="120"/>
-              <w:bottom w:type="dxa" w:w="80"/>
-              <w:right w:type="dxa" w:w="120"/>
-            </w:tcMar>
-            <w:vAlign w:val="center"/>
-          </w:tcPr>
-          <w:p>
-            <w:pPr>
-              <w:jc w:val="center"/>
-            </w:pPr>
-            <w:r>
-              <w:rPr>
-                <w:b w:val="false"/>
-                <w:bCs w:val="false"/>
-                <w:sz w:val="20"/>
-                <w:szCs w:val="20"/>
-              </w:rPr>
-              <w:t xml:space="preserve">Short factual asks and definitions. Pulls difficulty down, anchoring easy queries at T1.</w:t>
-            </w:r>
-          </w:p>
-        </w:tc>
-      </w:tr>
-      <w:tr>
-        <w:trPr>
-          <w:tblHeader w:val="false"/>
-        </w:trPr>
-        <w:tc>
-          <w:tcPr>
-            <w:tcW w:type="dxa" w:w="2900"/>
-            <w:tcBorders>
-              <w:top w:val="single" w:color="CCCCCC" w:sz="1"/>
-              <w:left w:val="single" w:color="CCCCCC" w:sz="1"/>
-              <w:bottom w:val="single" w:color="CCCCCC" w:sz="1"/>
-              <w:right w:val="single" w:color="CCCCCC" w:sz="1"/>
-            </w:tcBorders>
-            <w:shd w:fill="FFFFFF" w:val="clear"/>
-            <w:tcMar>
-              <w:top w:type="dxa" w:w="80"/>
-              <w:left w:type="dxa" w:w="120"/>
-              <w:bottom w:type="dxa" w:w="80"/>
-              <w:right w:type="dxa" w:w="120"/>
-            </w:tcMar>
-            <w:vAlign w:val="center"/>
-          </w:tcPr>
-          <w:p>
-            <w:pPr>
-              <w:jc w:val="left"/>
-            </w:pPr>
-            <w:r>
-              <w:rPr>
-                <w:b w:val="false"/>
-                <w:bCs w:val="false"/>
-                <w:sz w:val="20"/>
-                <w:szCs w:val="20"/>
-              </w:rPr>
-              <w:t xml:space="preserve">moderate_complexity</w:t>
-            </w:r>
-          </w:p>
-        </w:tc>
-        <w:tc>
-          <w:tcPr>
-            <w:tcW w:type="dxa" w:w="1300"/>
-            <w:tcBorders>
-              <w:top w:val="single" w:color="CCCCCC" w:sz="1"/>
-              <w:left w:val="single" w:color="CCCCCC" w:sz="1"/>
-              <w:bottom w:val="single" w:color="CCCCCC" w:sz="1"/>
-              <w:right w:val="single" w:color="CCCCCC" w:sz="1"/>
-            </w:tcBorders>
-            <w:shd w:fill="FFFFFF" w:val="clear"/>
-            <w:tcMar>
-              <w:top w:type="dxa" w:w="80"/>
-              <w:left w:type="dxa" w:w="120"/>
-              <w:bottom w:type="dxa" w:w="80"/>
-              <w:right w:type="dxa" w:w="120"/>
-            </w:tcMar>
-            <w:vAlign w:val="center"/>
-          </w:tcPr>
-          <w:p>
-            <w:pPr>
-              <w:jc w:val="center"/>
-            </w:pPr>
-            <w:r>
-              <w:rPr>
-                <w:b w:val="false"/>
-                <w:bCs w:val="false"/>
-                <w:sz w:val="20"/>
-                <w:szCs w:val="20"/>
-              </w:rPr>
-              <w:t xml:space="preserve">+0.22</w:t>
-            </w:r>
-          </w:p>
-        </w:tc>
-        <w:tc>
-          <w:tcPr>
-            <w:tcW w:type="dxa" w:w="5160"/>
-            <w:tcBorders>
-              <w:top w:val="single" w:color="CCCCCC" w:sz="1"/>
-              <w:left w:val="single" w:color="CCCCCC" w:sz="1"/>
-              <w:bottom w:val="single" w:color="CCCCCC" w:sz="1"/>
-              <w:right w:val="single" w:color="CCCCCC" w:sz="1"/>
-            </w:tcBorders>
-            <w:shd w:fill="FFFFFF" w:val="clear"/>
-            <w:tcMar>
-              <w:top w:type="dxa" w:w="80"/>
-              <w:left w:type="dxa" w:w="120"/>
-              <w:bottom w:type="dxa" w:w="80"/>
-              <w:right w:type="dxa" w:w="120"/>
-            </w:tcMar>
-            <w:vAlign w:val="center"/>
-          </w:tcPr>
-          <w:p>
-            <w:pPr>
-              <w:jc w:val="center"/>
-            </w:pPr>
-            <w:r>
-              <w:rPr>
-                <w:b w:val="false"/>
-                <w:bCs w:val="false"/>
-                <w:sz w:val="20"/>
-                <w:szCs w:val="20"/>
-              </w:rPr>
-              <w:t xml:space="preserve">Explain-how, compare-and-contrast, and basic-implementation prompts that belong in T2 or T3.</w:t>
-            </w:r>
-          </w:p>
-        </w:tc>
-      </w:tr>
-      <w:tr>
-        <w:trPr>
-          <w:tblHeader w:val="false"/>
-        </w:trPr>
-        <w:tc>
-          <w:tcPr>
-            <w:tcW w:type="dxa" w:w="2900"/>
-            <w:tcBorders>
-              <w:top w:val="single" w:color="CCCCCC" w:sz="1"/>
-              <w:left w:val="single" w:color="CCCCCC" w:sz="1"/>
-              <w:bottom w:val="single" w:color="CCCCCC" w:sz="1"/>
-              <w:right w:val="single" w:color="CCCCCC" w:sz="1"/>
-            </w:tcBorders>
-            <w:shd w:fill="FFFFFF" w:val="clear"/>
-            <w:tcMar>
-              <w:top w:type="dxa" w:w="80"/>
-              <w:left w:type="dxa" w:w="120"/>
-              <w:bottom w:type="dxa" w:w="80"/>
-              <w:right w:type="dxa" w:w="120"/>
-            </w:tcMar>
-            <w:vAlign w:val="center"/>
-          </w:tcPr>
-          <w:p>
-            <w:pPr>
-              <w:jc w:val="left"/>
-            </w:pPr>
-            <w:r>
-              <w:rPr>
-                <w:b w:val="false"/>
-                <w:bCs w:val="false"/>
-                <w:sz w:val="20"/>
-                <w:szCs w:val="20"/>
-              </w:rPr>
-              <w:t xml:space="preserve">argumentative_construction</w:t>
-            </w:r>
-          </w:p>
-        </w:tc>
-        <w:tc>
-          <w:tcPr>
-            <w:tcW w:type="dxa" w:w="1300"/>
-            <w:tcBorders>
-              <w:top w:val="single" w:color="CCCCCC" w:sz="1"/>
-              <w:left w:val="single" w:color="CCCCCC" w:sz="1"/>
-              <w:bottom w:val="single" w:color="CCCCCC" w:sz="1"/>
-              <w:right w:val="single" w:color="CCCCCC" w:sz="1"/>
-            </w:tcBorders>
-            <w:shd w:fill="FFFFFF" w:val="clear"/>
-            <w:tcMar>
-              <w:top w:type="dxa" w:w="80"/>
-              <w:left w:type="dxa" w:w="120"/>
-              <w:bottom w:type="dxa" w:w="80"/>
-              <w:right w:type="dxa" w:w="120"/>
-            </w:tcMar>
-            <w:vAlign w:val="center"/>
-          </w:tcPr>
-          <w:p>
-            <w:pPr>
-              <w:jc w:val="center"/>
-            </w:pPr>
-            <w:r>
-              <w:rPr>
-                <w:b w:val="false"/>
-                <w:bCs w:val="false"/>
-                <w:sz w:val="20"/>
-                <w:szCs w:val="20"/>
-              </w:rPr>
-              <w:t xml:space="preserve">+0.18</w:t>
-            </w:r>
-          </w:p>
-        </w:tc>
-        <w:tc>
-          <w:tcPr>
-            <w:tcW w:type="dxa" w:w="5160"/>
-            <w:tcBorders>
-              <w:top w:val="single" w:color="CCCCCC" w:sz="1"/>
-              <w:left w:val="single" w:color="CCCCCC" w:sz="1"/>
-              <w:bottom w:val="single" w:color="CCCCCC" w:sz="1"/>
-              <w:right w:val="single" w:color="CCCCCC" w:sz="1"/>
-            </w:tcBorders>
-            <w:shd w:fill="FFFFFF" w:val="clear"/>
-            <w:tcMar>
-              <w:top w:type="dxa" w:w="80"/>
-              <w:left w:type="dxa" w:w="120"/>
-              <w:bottom w:type="dxa" w:w="80"/>
-              <w:right w:type="dxa" w:w="120"/>
-            </w:tcMar>
-            <w:vAlign w:val="center"/>
-          </w:tcPr>
-          <w:p>
-            <w:pPr>
-              <w:jc w:val="center"/>
-            </w:pPr>
-            <w:r>
-              <w:rPr>
-                <w:b w:val="false"/>
-                <w:bCs w:val="false"/>
-                <w:sz w:val="20"/>
-                <w:szCs w:val="20"/>
-              </w:rPr>
-              <w:t xml:space="preserve">Prompts that demand a position, recommendation, or diagnosis, the T4 judgment pattern.</w:t>
-            </w:r>
-          </w:p>
-        </w:tc>
-      </w:tr>
-      <w:tr>
-        <w:trPr>
-          <w:tblHeader w:val="false"/>
-        </w:trPr>
-        <w:tc>
-          <w:tcPr>
-            <w:tcW w:type="dxa" w:w="2900"/>
-            <w:tcBorders>
-              <w:top w:val="single" w:color="CCCCCC" w:sz="1"/>
-              <w:left w:val="single" w:color="CCCCCC" w:sz="1"/>
-              <w:bottom w:val="single" w:color="CCCCCC" w:sz="1"/>
-              <w:right w:val="single" w:color="CCCCCC" w:sz="1"/>
-            </w:tcBorders>
-            <w:shd w:fill="FFFFFF" w:val="clear"/>
-            <w:tcMar>
-              <w:top w:type="dxa" w:w="80"/>
-              <w:left w:type="dxa" w:w="120"/>
-              <w:bottom w:type="dxa" w:w="80"/>
-              <w:right w:type="dxa" w:w="120"/>
-            </w:tcMar>
-            <w:vAlign w:val="center"/>
-          </w:tcPr>
-          <w:p>
-            <w:pPr>
-              <w:jc w:val="left"/>
-            </w:pPr>
-            <w:r>
-              <w:rPr>
-                <w:b w:val="false"/>
-                <w:bCs w:val="false"/>
-                <w:sz w:val="20"/>
-                <w:szCs w:val="20"/>
-              </w:rPr>
-              <w:t xml:space="preserve">frontier_synthesis</w:t>
-            </w:r>
-          </w:p>
-        </w:tc>
-        <w:tc>
-          <w:tcPr>
-            <w:tcW w:type="dxa" w:w="1300"/>
-            <w:tcBorders>
-              <w:top w:val="single" w:color="CCCCCC" w:sz="1"/>
-              <w:left w:val="single" w:color="CCCCCC" w:sz="1"/>
-              <w:bottom w:val="single" w:color="CCCCCC" w:sz="1"/>
-              <w:right w:val="single" w:color="CCCCCC" w:sz="1"/>
-            </w:tcBorders>
-            <w:shd w:fill="FFFFFF" w:val="clear"/>
-            <w:tcMar>
-              <w:top w:type="dxa" w:w="80"/>
-              <w:left w:type="dxa" w:w="120"/>
-              <w:bottom w:type="dxa" w:w="80"/>
-              <w:right w:type="dxa" w:w="120"/>
-            </w:tcMar>
-            <w:vAlign w:val="center"/>
-          </w:tcPr>
-          <w:p>
-            <w:pPr>
-              <w:jc w:val="center"/>
-            </w:pPr>
-            <w:r>
-              <w:rPr>
-                <w:b w:val="false"/>
-                <w:bCs w:val="false"/>
-                <w:sz w:val="20"/>
-                <w:szCs w:val="20"/>
-              </w:rPr>
-              <w:t xml:space="preserve">+0.15</w:t>
-            </w:r>
-          </w:p>
-        </w:tc>
-        <w:tc>
-          <w:tcPr>
-            <w:tcW w:type="dxa" w:w="5160"/>
-            <w:tcBorders>
-              <w:top w:val="single" w:color="CCCCCC" w:sz="1"/>
-              <w:left w:val="single" w:color="CCCCCC" w:sz="1"/>
-              <w:bottom w:val="single" w:color="CCCCCC" w:sz="1"/>
-              <w:right w:val="single" w:color="CCCCCC" w:sz="1"/>
-            </w:tcBorders>
-            <w:shd w:fill="FFFFFF" w:val="clear"/>
-            <w:tcMar>
-              <w:top w:type="dxa" w:w="80"/>
-              <w:left w:type="dxa" w:w="120"/>
-              <w:bottom w:type="dxa" w:w="80"/>
-              <w:right w:type="dxa" w:w="120"/>
-            </w:tcMar>
-            <w:vAlign w:val="center"/>
-          </w:tcPr>
-          <w:p>
-            <w:pPr>
-              <w:jc w:val="center"/>
-            </w:pPr>
-            <w:r>
-              <w:rPr>
-                <w:b w:val="false"/>
-                <w:bCs w:val="false"/>
-                <w:sz w:val="20"/>
-                <w:szCs w:val="20"/>
-              </w:rPr>
-              <w:t xml:space="preserve">Long-form original argument and multi-domain synthesis, the T5 pattern.</w:t>
-            </w:r>
-          </w:p>
-        </w:tc>
-      </w:tr>
-    </w:tbl>
-    <w:p>
-      <w:pPr>
-        <w:spacing w:after="120"/>
-      </w:pPr>
-      <w:r>
-        <w:t xml:space="preserve"/>
-      </w:r>
-    </w:p>
-    <w:p>
-      <w:pPr>
-        <w:spacing w:after="160" w:line="276"/>
-        <w:jc w:val="both"/>
-      </w:pPr>
-      <w:r>
-        <w:t xml:space="preserve">A signal with a negative weight is a detractor: when it fires, it lowers the difficulty score. The trivial_lookup detractor is the upstream-recommended way to firmly anchor short factual questions in the cheapest tier. Structure signals add small mechanical adjustments: a prompt under twelve words subtracts a little, a prompt over twenty-five words adds a little, and a very long prompt adds more.</w:t>
-      </w:r>
-    </w:p>
-    <w:p>
-      <w:pPr>
-        <w:pStyle w:val="Heading2"/>
-      </w:pPr>
-      <w:r>
-        <w:t xml:space="preserve">5.4 Set the scoring and the bands</w:t>
-      </w:r>
-    </w:p>
-    <w:p>
-      <w:pPr>
-        <w:spacing w:after="160" w:line="276"/>
-        <w:jc w:val="both"/>
-      </w:pPr>
-      <w:r>
-        <w:t xml:space="preserve">Each signal contributes its weight times its confidence to a single difficulty score. Four cutoffs split that score into five bands, one per tier. In this configuration the cutoffs are 0.03, 0.10, 0.18, and 0.40, against a practical score range of roughly minus 0.15 to 0.70. A trivial question that strongly matches the detractor lands below the first cutoff and routes to T1. A question that fires the frontier signal and the long-prompt signal clears the top cutoff and routes to T5.</w:t>
+        <w:t xml:space="preserve">The router framework gives you four categories of signal. The categories and the math that combines them are fixed. The content of each signal is yours to supply. That division is the whole picture:</w:t>
       </w:r>
     </w:p>
     <w:p>
@@ -2075,9 +1509,9 @@
       <w:r>
         <w:drawing>
           <wp:inline distT="0" distB="0" distL="0" distR="0">
-            <wp:extent cx="5715000" cy="1809750"/>
+            <wp:extent cx="5715000" cy="3619500"/>
             <wp:effectExtent t="0" r="0" b="0" l="0"/>
-            <wp:docPr id="1" name="fig_banding.png" descr="Figure 4. The scoring model in one line. Every signal feeds a single weighted sum, and four cutoffs partition that score into the five tier bands." title="Figure 4. The scoring model in one line. Every signal feeds a single weighted sum, and four cutoffs partition that score into the five tier bands."/>
+            <wp:docPr id="1" name="fig_score_anatomy.png" descr="Figure 4. Anatomy of the difficulty score. Each of the four signal categories contributes to one weighted sum, and four cutoffs split that sum into tier bands. The categories and the math are built into the router; the signals, exemplars, weights, thresholds, and cutoffs are yours." title="Figure 4. Anatomy of the difficulty score. Each of the four signal categories contributes to one weighted sum, and four cutoffs split that sum into tier bands. The categories and the math are built into the router; the signals, exemplars, weights, thresholds, and cutoffs are yours."/>
             <wp:cNvGraphicFramePr>
               <a:graphicFrameLocks xmlns:a="http://schemas.openxmlformats.org/drawingml/2006/main" noChangeAspect="1"/>
             </wp:cNvGraphicFramePr>
@@ -2100,7 +1534,7 @@
                   <pic:spPr bwMode="auto">
                     <a:xfrm>
                       <a:off x="0" y="0"/>
-                      <a:ext cx="5715000" cy="1809750"/>
+                      <a:ext cx="5715000" cy="3619500"/>
                     </a:xfrm>
                     <a:prstGeom prst="rect">
                       <a:avLst/>
@@ -2126,15 +1560,392 @@
           <w:sz w:val="18"/>
           <w:szCs w:val="18"/>
         </w:rPr>
-        <w:t xml:space="preserve">Figure 4. The scoring model in one line. Every signal feeds a single weighted sum, and four cutoffs partition that score into the five tier bands.</w:t>
-      </w:r>
-    </w:p>
-    <w:p>
-      <w:pPr>
-        <w:pStyle w:val="Heading1"/>
-      </w:pPr>
-      <w:r>
-        <w:t xml:space="preserve">6. Tuning for best results</w:t>
+        <w:t xml:space="preserve">Figure 4. Anatomy of the difficulty score. Each of the four signal categories contributes to one weighted sum, and four cutoffs split that sum into tier bands. The categories and the math are built into the router; the signals, exemplars, weights, thresholds, and cutoffs are yours.</w:t>
+      </w:r>
+    </w:p>
+    <w:tbl>
+      <w:tblPr>
+        <w:tblW w:type="dxa" w:w="9360"/>
+        <w:tblBorders>
+          <w:top w:val="single" w:color="auto" w:sz="4"/>
+          <w:left w:val="single" w:color="auto" w:sz="4"/>
+          <w:bottom w:val="single" w:color="auto" w:sz="4"/>
+          <w:right w:val="single" w:color="auto" w:sz="4"/>
+          <w:insideH w:val="single" w:color="auto" w:sz="4"/>
+          <w:insideV w:val="single" w:color="auto" w:sz="4"/>
+        </w:tblBorders>
+      </w:tblPr>
+      <w:tblGrid>
+        <w:gridCol w:w="4680"/>
+        <w:gridCol w:w="4680"/>
+      </w:tblGrid>
+      <w:tr>
+        <w:trPr>
+          <w:cantSplit/>
+          <w:tblHeader/>
+        </w:trPr>
+        <w:tc>
+          <w:tcPr>
+            <w:tcW w:type="dxa" w:w="4680"/>
+            <w:tcBorders>
+              <w:top w:val="single" w:color="CCCCCC" w:sz="1"/>
+              <w:left w:val="single" w:color="CCCCCC" w:sz="1"/>
+              <w:bottom w:val="single" w:color="CCCCCC" w:sz="1"/>
+              <w:right w:val="single" w:color="CCCCCC" w:sz="1"/>
+            </w:tcBorders>
+            <w:shd w:fill="d5e8f0" w:val="clear"/>
+            <w:tcMar>
+              <w:top w:type="dxa" w:w="80"/>
+              <w:left w:type="dxa" w:w="120"/>
+              <w:bottom w:type="dxa" w:w="80"/>
+              <w:right w:type="dxa" w:w="120"/>
+            </w:tcMar>
+            <w:vAlign w:val="center"/>
+          </w:tcPr>
+          <w:p>
+            <w:pPr>
+              <w:jc w:val="left"/>
+            </w:pPr>
+            <w:r>
+              <w:rPr>
+                <w:b/>
+                <w:bCs/>
+                <w:sz w:val="20"/>
+                <w:szCs w:val="20"/>
+              </w:rPr>
+              <w:t xml:space="preserve">Fixed by vLLM Semantic Router</w:t>
+            </w:r>
+          </w:p>
+        </w:tc>
+        <w:tc>
+          <w:tcPr>
+            <w:tcW w:type="dxa" w:w="4680"/>
+            <w:tcBorders>
+              <w:top w:val="single" w:color="CCCCCC" w:sz="1"/>
+              <w:left w:val="single" w:color="CCCCCC" w:sz="1"/>
+              <w:bottom w:val="single" w:color="CCCCCC" w:sz="1"/>
+              <w:right w:val="single" w:color="CCCCCC" w:sz="1"/>
+            </w:tcBorders>
+            <w:shd w:fill="d5e8f0" w:val="clear"/>
+            <w:tcMar>
+              <w:top w:type="dxa" w:w="80"/>
+              <w:left w:type="dxa" w:w="120"/>
+              <w:bottom w:type="dxa" w:w="80"/>
+              <w:right w:type="dxa" w:w="120"/>
+            </w:tcMar>
+            <w:vAlign w:val="center"/>
+          </w:tcPr>
+          <w:p>
+            <w:pPr>
+              <w:jc w:val="center"/>
+            </w:pPr>
+            <w:r>
+              <w:rPr>
+                <w:b/>
+                <w:bCs/>
+                <w:sz w:val="20"/>
+                <w:szCs w:val="20"/>
+              </w:rPr>
+              <w:t xml:space="preserve">Chosen by you</w:t>
+            </w:r>
+          </w:p>
+        </w:tc>
+      </w:tr>
+      <w:tr>
+        <w:trPr>
+          <w:cantSplit/>
+          <w:tblHeader w:val="false"/>
+        </w:trPr>
+        <w:tc>
+          <w:tcPr>
+            <w:tcW w:type="dxa" w:w="4680"/>
+            <w:tcBorders>
+              <w:top w:val="single" w:color="CCCCCC" w:sz="1"/>
+              <w:left w:val="single" w:color="CCCCCC" w:sz="1"/>
+              <w:bottom w:val="single" w:color="CCCCCC" w:sz="1"/>
+              <w:right w:val="single" w:color="CCCCCC" w:sz="1"/>
+            </w:tcBorders>
+            <w:shd w:fill="FFFFFF" w:val="clear"/>
+            <w:tcMar>
+              <w:top w:type="dxa" w:w="80"/>
+              <w:left w:type="dxa" w:w="120"/>
+              <w:bottom w:type="dxa" w:w="80"/>
+              <w:right w:type="dxa" w:w="120"/>
+            </w:tcMar>
+            <w:vAlign w:val="center"/>
+          </w:tcPr>
+          <w:p>
+            <w:pPr>
+              <w:jc w:val="left"/>
+            </w:pPr>
+            <w:r>
+              <w:rPr>
+                <w:b w:val="false"/>
+                <w:bCs w:val="false"/>
+                <w:sz w:val="20"/>
+                <w:szCs w:val="20"/>
+              </w:rPr>
+              <w:t xml:space="preserve">The four signal categories: complexity, embeddings, structure, context</w:t>
+            </w:r>
+          </w:p>
+        </w:tc>
+        <w:tc>
+          <w:tcPr>
+            <w:tcW w:type="dxa" w:w="4680"/>
+            <w:tcBorders>
+              <w:top w:val="single" w:color="CCCCCC" w:sz="1"/>
+              <w:left w:val="single" w:color="CCCCCC" w:sz="1"/>
+              <w:bottom w:val="single" w:color="CCCCCC" w:sz="1"/>
+              <w:right w:val="single" w:color="CCCCCC" w:sz="1"/>
+            </w:tcBorders>
+            <w:shd w:fill="FFFFFF" w:val="clear"/>
+            <w:tcMar>
+              <w:top w:type="dxa" w:w="80"/>
+              <w:left w:type="dxa" w:w="120"/>
+              <w:bottom w:type="dxa" w:w="80"/>
+              <w:right w:type="dxa" w:w="120"/>
+            </w:tcMar>
+            <w:vAlign w:val="center"/>
+          </w:tcPr>
+          <w:p>
+            <w:pPr>
+              <w:jc w:val="center"/>
+            </w:pPr>
+            <w:r>
+              <w:rPr>
+                <w:b w:val="false"/>
+                <w:bCs w:val="false"/>
+                <w:sz w:val="20"/>
+                <w:szCs w:val="20"/>
+              </w:rPr>
+              <w:t xml:space="preserve">Which signals to create within each category</w:t>
+            </w:r>
+          </w:p>
+        </w:tc>
+      </w:tr>
+      <w:tr>
+        <w:trPr>
+          <w:cantSplit/>
+          <w:tblHeader w:val="false"/>
+        </w:trPr>
+        <w:tc>
+          <w:tcPr>
+            <w:tcW w:type="dxa" w:w="4680"/>
+            <w:tcBorders>
+              <w:top w:val="single" w:color="CCCCCC" w:sz="1"/>
+              <w:left w:val="single" w:color="CCCCCC" w:sz="1"/>
+              <w:bottom w:val="single" w:color="CCCCCC" w:sz="1"/>
+              <w:right w:val="single" w:color="CCCCCC" w:sz="1"/>
+            </w:tcBorders>
+            <w:shd w:fill="FFFFFF" w:val="clear"/>
+            <w:tcMar>
+              <w:top w:type="dxa" w:w="80"/>
+              <w:left w:type="dxa" w:w="120"/>
+              <w:bottom w:type="dxa" w:w="80"/>
+              <w:right w:type="dxa" w:w="120"/>
+            </w:tcMar>
+            <w:vAlign w:val="center"/>
+          </w:tcPr>
+          <w:p>
+            <w:pPr>
+              <w:jc w:val="left"/>
+            </w:pPr>
+            <w:r>
+              <w:rPr>
+                <w:b w:val="false"/>
+                <w:bCs w:val="false"/>
+                <w:sz w:val="20"/>
+                <w:szCs w:val="20"/>
+              </w:rPr>
+              <w:t xml:space="preserve">The contrastive classifier and the embedding model</w:t>
+            </w:r>
+          </w:p>
+        </w:tc>
+        <w:tc>
+          <w:tcPr>
+            <w:tcW w:type="dxa" w:w="4680"/>
+            <w:tcBorders>
+              <w:top w:val="single" w:color="CCCCCC" w:sz="1"/>
+              <w:left w:val="single" w:color="CCCCCC" w:sz="1"/>
+              <w:bottom w:val="single" w:color="CCCCCC" w:sz="1"/>
+              <w:right w:val="single" w:color="CCCCCC" w:sz="1"/>
+            </w:tcBorders>
+            <w:shd w:fill="FFFFFF" w:val="clear"/>
+            <w:tcMar>
+              <w:top w:type="dxa" w:w="80"/>
+              <w:left w:type="dxa" w:w="120"/>
+              <w:bottom w:type="dxa" w:w="80"/>
+              <w:right w:type="dxa" w:w="120"/>
+            </w:tcMar>
+            <w:vAlign w:val="center"/>
+          </w:tcPr>
+          <w:p>
+            <w:pPr>
+              <w:jc w:val="center"/>
+            </w:pPr>
+            <w:r>
+              <w:rPr>
+                <w:b w:val="false"/>
+                <w:bCs w:val="false"/>
+                <w:sz w:val="20"/>
+                <w:szCs w:val="20"/>
+              </w:rPr>
+              <w:t xml:space="preserve">The exemplar prompts that fill each signal bank</w:t>
+            </w:r>
+          </w:p>
+        </w:tc>
+      </w:tr>
+      <w:tr>
+        <w:trPr>
+          <w:cantSplit/>
+          <w:tblHeader w:val="false"/>
+        </w:trPr>
+        <w:tc>
+          <w:tcPr>
+            <w:tcW w:type="dxa" w:w="4680"/>
+            <w:tcBorders>
+              <w:top w:val="single" w:color="CCCCCC" w:sz="1"/>
+              <w:left w:val="single" w:color="CCCCCC" w:sz="1"/>
+              <w:bottom w:val="single" w:color="CCCCCC" w:sz="1"/>
+              <w:right w:val="single" w:color="CCCCCC" w:sz="1"/>
+            </w:tcBorders>
+            <w:shd w:fill="FFFFFF" w:val="clear"/>
+            <w:tcMar>
+              <w:top w:type="dxa" w:w="80"/>
+              <w:left w:type="dxa" w:w="120"/>
+              <w:bottom w:type="dxa" w:w="80"/>
+              <w:right w:type="dxa" w:w="120"/>
+            </w:tcMar>
+            <w:vAlign w:val="center"/>
+          </w:tcPr>
+          <w:p>
+            <w:pPr>
+              <w:jc w:val="left"/>
+            </w:pPr>
+            <w:r>
+              <w:rPr>
+                <w:b w:val="false"/>
+                <w:bCs w:val="false"/>
+                <w:sz w:val="20"/>
+                <w:szCs w:val="20"/>
+              </w:rPr>
+              <w:t xml:space="preserve">The weighted-sum and threshold-band scoring math</w:t>
+            </w:r>
+          </w:p>
+        </w:tc>
+        <w:tc>
+          <w:tcPr>
+            <w:tcW w:type="dxa" w:w="4680"/>
+            <w:tcBorders>
+              <w:top w:val="single" w:color="CCCCCC" w:sz="1"/>
+              <w:left w:val="single" w:color="CCCCCC" w:sz="1"/>
+              <w:bottom w:val="single" w:color="CCCCCC" w:sz="1"/>
+              <w:right w:val="single" w:color="CCCCCC" w:sz="1"/>
+            </w:tcBorders>
+            <w:shd w:fill="FFFFFF" w:val="clear"/>
+            <w:tcMar>
+              <w:top w:type="dxa" w:w="80"/>
+              <w:left w:type="dxa" w:w="120"/>
+              <w:bottom w:type="dxa" w:w="80"/>
+              <w:right w:type="dxa" w:w="120"/>
+            </w:tcMar>
+            <w:vAlign w:val="center"/>
+          </w:tcPr>
+          <w:p>
+            <w:pPr>
+              <w:jc w:val="center"/>
+            </w:pPr>
+            <w:r>
+              <w:rPr>
+                <w:b w:val="false"/>
+                <w:bCs w:val="false"/>
+                <w:sz w:val="20"/>
+                <w:szCs w:val="20"/>
+              </w:rPr>
+              <w:t xml:space="preserve">Each signal's weight, its sign, and its threshold</w:t>
+            </w:r>
+          </w:p>
+        </w:tc>
+      </w:tr>
+      <w:tr>
+        <w:trPr>
+          <w:cantSplit/>
+          <w:tblHeader w:val="false"/>
+        </w:trPr>
+        <w:tc>
+          <w:tcPr>
+            <w:tcW w:type="dxa" w:w="4680"/>
+            <w:tcBorders>
+              <w:top w:val="single" w:color="CCCCCC" w:sz="1"/>
+              <w:left w:val="single" w:color="CCCCCC" w:sz="1"/>
+              <w:bottom w:val="single" w:color="CCCCCC" w:sz="1"/>
+              <w:right w:val="single" w:color="CCCCCC" w:sz="1"/>
+            </w:tcBorders>
+            <w:shd w:fill="FFFFFF" w:val="clear"/>
+            <w:tcMar>
+              <w:top w:type="dxa" w:w="80"/>
+              <w:left w:type="dxa" w:w="120"/>
+              <w:bottom w:type="dxa" w:w="80"/>
+              <w:right w:type="dxa" w:w="120"/>
+            </w:tcMar>
+            <w:vAlign w:val="center"/>
+          </w:tcPr>
+          <w:p>
+            <w:pPr>
+              <w:jc w:val="left"/>
+            </w:pPr>
+            <w:r>
+              <w:rPr>
+                <w:b w:val="false"/>
+                <w:bCs w:val="false"/>
+                <w:sz w:val="20"/>
+                <w:szCs w:val="20"/>
+              </w:rPr>
+              <w:t xml:space="preserve">The routing decision headers returned per request</w:t>
+            </w:r>
+          </w:p>
+        </w:tc>
+        <w:tc>
+          <w:tcPr>
+            <w:tcW w:type="dxa" w:w="4680"/>
+            <w:tcBorders>
+              <w:top w:val="single" w:color="CCCCCC" w:sz="1"/>
+              <w:left w:val="single" w:color="CCCCCC" w:sz="1"/>
+              <w:bottom w:val="single" w:color="CCCCCC" w:sz="1"/>
+              <w:right w:val="single" w:color="CCCCCC" w:sz="1"/>
+            </w:tcBorders>
+            <w:shd w:fill="FFFFFF" w:val="clear"/>
+            <w:tcMar>
+              <w:top w:type="dxa" w:w="80"/>
+              <w:left w:type="dxa" w:w="120"/>
+              <w:bottom w:type="dxa" w:w="80"/>
+              <w:right w:type="dxa" w:w="120"/>
+            </w:tcMar>
+            <w:vAlign w:val="center"/>
+          </w:tcPr>
+          <w:p>
+            <w:pPr>
+              <w:jc w:val="center"/>
+            </w:pPr>
+            <w:r>
+              <w:rPr>
+                <w:b w:val="false"/>
+                <w:bCs w:val="false"/>
+                <w:sz w:val="20"/>
+                <w:szCs w:val="20"/>
+              </w:rPr>
+              <w:t xml:space="preserve">The four cutoffs that separate the five tier bands</w:t>
+            </w:r>
+          </w:p>
+        </w:tc>
+      </w:tr>
+    </w:tbl>
+    <w:p>
+      <w:pPr>
+        <w:spacing w:after="120"/>
+      </w:pPr>
+      <w:r>
+        <w:t xml:space="preserve"/>
       </w:r>
     </w:p>
     <w:p>
@@ -2143,79 +1954,1758 @@
         <w:jc w:val="both"/>
       </w:pPr>
       <w:r>
-        <w:t xml:space="preserve">Routing quality is governed by three tuning surfaces, all in the one configuration file: the exemplar banks, the per-signal weights, and the band cutoffs. Tuning is the work of moving misrouted queries into the right band without dragging correctly-routed queries out of theirs. A few lessons from building this system generalize.</w:t>
+        <w:t xml:space="preserve">The four categories differ in what they measure and in whether they need exemplars:</w:t>
+      </w:r>
+    </w:p>
+    <w:tbl>
+      <w:tblPr>
+        <w:tblW w:type="dxa" w:w="9360"/>
+        <w:tblBorders>
+          <w:top w:val="single" w:color="auto" w:sz="4"/>
+          <w:left w:val="single" w:color="auto" w:sz="4"/>
+          <w:bottom w:val="single" w:color="auto" w:sz="4"/>
+          <w:right w:val="single" w:color="auto" w:sz="4"/>
+          <w:insideH w:val="single" w:color="auto" w:sz="4"/>
+          <w:insideV w:val="single" w:color="auto" w:sz="4"/>
+        </w:tblBorders>
+      </w:tblPr>
+      <w:tblGrid>
+        <w:gridCol w:w="2350"/>
+        <w:gridCol w:w="4310"/>
+        <w:gridCol w:w="1200"/>
+        <w:gridCol w:w="1500"/>
+      </w:tblGrid>
+      <w:tr>
+        <w:trPr>
+          <w:cantSplit/>
+          <w:tblHeader/>
+        </w:trPr>
+        <w:tc>
+          <w:tcPr>
+            <w:tcW w:type="dxa" w:w="2350"/>
+            <w:tcBorders>
+              <w:top w:val="single" w:color="CCCCCC" w:sz="1"/>
+              <w:left w:val="single" w:color="CCCCCC" w:sz="1"/>
+              <w:bottom w:val="single" w:color="CCCCCC" w:sz="1"/>
+              <w:right w:val="single" w:color="CCCCCC" w:sz="1"/>
+            </w:tcBorders>
+            <w:shd w:fill="d5e8f0" w:val="clear"/>
+            <w:tcMar>
+              <w:top w:type="dxa" w:w="80"/>
+              <w:left w:type="dxa" w:w="120"/>
+              <w:bottom w:type="dxa" w:w="80"/>
+              <w:right w:type="dxa" w:w="120"/>
+            </w:tcMar>
+            <w:vAlign w:val="center"/>
+          </w:tcPr>
+          <w:p>
+            <w:pPr>
+              <w:jc w:val="left"/>
+            </w:pPr>
+            <w:r>
+              <w:rPr>
+                <w:b/>
+                <w:bCs/>
+                <w:sz w:val="20"/>
+                <w:szCs w:val="20"/>
+              </w:rPr>
+              <w:t xml:space="preserve">Category</w:t>
+            </w:r>
+          </w:p>
+        </w:tc>
+        <w:tc>
+          <w:tcPr>
+            <w:tcW w:type="dxa" w:w="4310"/>
+            <w:tcBorders>
+              <w:top w:val="single" w:color="CCCCCC" w:sz="1"/>
+              <w:left w:val="single" w:color="CCCCCC" w:sz="1"/>
+              <w:bottom w:val="single" w:color="CCCCCC" w:sz="1"/>
+              <w:right w:val="single" w:color="CCCCCC" w:sz="1"/>
+            </w:tcBorders>
+            <w:shd w:fill="d5e8f0" w:val="clear"/>
+            <w:tcMar>
+              <w:top w:type="dxa" w:w="80"/>
+              <w:left w:type="dxa" w:w="120"/>
+              <w:bottom w:type="dxa" w:w="80"/>
+              <w:right w:type="dxa" w:w="120"/>
+            </w:tcMar>
+            <w:vAlign w:val="center"/>
+          </w:tcPr>
+          <w:p>
+            <w:pPr>
+              <w:jc w:val="center"/>
+            </w:pPr>
+            <w:r>
+              <w:rPr>
+                <w:b/>
+                <w:bCs/>
+                <w:sz w:val="20"/>
+                <w:szCs w:val="20"/>
+              </w:rPr>
+              <w:t xml:space="preserve">What it measures</w:t>
+            </w:r>
+          </w:p>
+        </w:tc>
+        <w:tc>
+          <w:tcPr>
+            <w:tcW w:type="dxa" w:w="1200"/>
+            <w:tcBorders>
+              <w:top w:val="single" w:color="CCCCCC" w:sz="1"/>
+              <w:left w:val="single" w:color="CCCCCC" w:sz="1"/>
+              <w:bottom w:val="single" w:color="CCCCCC" w:sz="1"/>
+              <w:right w:val="single" w:color="CCCCCC" w:sz="1"/>
+            </w:tcBorders>
+            <w:shd w:fill="d5e8f0" w:val="clear"/>
+            <w:tcMar>
+              <w:top w:type="dxa" w:w="80"/>
+              <w:left w:type="dxa" w:w="120"/>
+              <w:bottom w:type="dxa" w:w="80"/>
+              <w:right w:type="dxa" w:w="120"/>
+            </w:tcMar>
+            <w:vAlign w:val="center"/>
+          </w:tcPr>
+          <w:p>
+            <w:pPr>
+              <w:jc w:val="center"/>
+            </w:pPr>
+            <w:r>
+              <w:rPr>
+                <w:b/>
+                <w:bCs/>
+                <w:sz w:val="20"/>
+                <w:szCs w:val="20"/>
+              </w:rPr>
+              <w:t xml:space="preserve">Exemplars?</w:t>
+            </w:r>
+          </w:p>
+        </w:tc>
+        <w:tc>
+          <w:tcPr>
+            <w:tcW w:type="dxa" w:w="1500"/>
+            <w:tcBorders>
+              <w:top w:val="single" w:color="CCCCCC" w:sz="1"/>
+              <w:left w:val="single" w:color="CCCCCC" w:sz="1"/>
+              <w:bottom w:val="single" w:color="CCCCCC" w:sz="1"/>
+              <w:right w:val="single" w:color="CCCCCC" w:sz="1"/>
+            </w:tcBorders>
+            <w:shd w:fill="d5e8f0" w:val="clear"/>
+            <w:tcMar>
+              <w:top w:type="dxa" w:w="80"/>
+              <w:left w:type="dxa" w:w="120"/>
+              <w:bottom w:type="dxa" w:w="80"/>
+              <w:right w:type="dxa" w:w="120"/>
+            </w:tcMar>
+            <w:vAlign w:val="center"/>
+          </w:tcPr>
+          <w:p>
+            <w:pPr>
+              <w:jc w:val="center"/>
+            </w:pPr>
+            <w:r>
+              <w:rPr>
+                <w:b/>
+                <w:bCs/>
+                <w:sz w:val="20"/>
+                <w:szCs w:val="20"/>
+              </w:rPr>
+              <w:t xml:space="preserve">How it fires</w:t>
+            </w:r>
+          </w:p>
+        </w:tc>
+      </w:tr>
+      <w:tr>
+        <w:trPr>
+          <w:cantSplit/>
+          <w:tblHeader w:val="false"/>
+        </w:trPr>
+        <w:tc>
+          <w:tcPr>
+            <w:tcW w:type="dxa" w:w="2350"/>
+            <w:tcBorders>
+              <w:top w:val="single" w:color="CCCCCC" w:sz="1"/>
+              <w:left w:val="single" w:color="CCCCCC" w:sz="1"/>
+              <w:bottom w:val="single" w:color="CCCCCC" w:sz="1"/>
+              <w:right w:val="single" w:color="CCCCCC" w:sz="1"/>
+            </w:tcBorders>
+            <w:shd w:fill="FFFFFF" w:val="clear"/>
+            <w:tcMar>
+              <w:top w:type="dxa" w:w="80"/>
+              <w:left w:type="dxa" w:w="120"/>
+              <w:bottom w:type="dxa" w:w="80"/>
+              <w:right w:type="dxa" w:w="120"/>
+            </w:tcMar>
+            <w:vAlign w:val="center"/>
+          </w:tcPr>
+          <w:p>
+            <w:pPr>
+              <w:jc w:val="left"/>
+            </w:pPr>
+            <w:r>
+              <w:rPr>
+                <w:b w:val="false"/>
+                <w:bCs w:val="false"/>
+                <w:sz w:val="20"/>
+                <w:szCs w:val="20"/>
+              </w:rPr>
+              <w:t xml:space="preserve">Complexity</w:t>
+            </w:r>
+          </w:p>
+        </w:tc>
+        <w:tc>
+          <w:tcPr>
+            <w:tcW w:type="dxa" w:w="4310"/>
+            <w:tcBorders>
+              <w:top w:val="single" w:color="CCCCCC" w:sz="1"/>
+              <w:left w:val="single" w:color="CCCCCC" w:sz="1"/>
+              <w:bottom w:val="single" w:color="CCCCCC" w:sz="1"/>
+              <w:right w:val="single" w:color="CCCCCC" w:sz="1"/>
+            </w:tcBorders>
+            <w:shd w:fill="FFFFFF" w:val="clear"/>
+            <w:tcMar>
+              <w:top w:type="dxa" w:w="80"/>
+              <w:left w:type="dxa" w:w="120"/>
+              <w:bottom w:type="dxa" w:w="80"/>
+              <w:right w:type="dxa" w:w="120"/>
+            </w:tcMar>
+            <w:vAlign w:val="center"/>
+          </w:tcPr>
+          <w:p>
+            <w:pPr>
+              <w:jc w:val="center"/>
+            </w:pPr>
+            <w:r>
+              <w:rPr>
+                <w:b w:val="false"/>
+                <w:bCs w:val="false"/>
+                <w:sz w:val="20"/>
+                <w:szCs w:val="20"/>
+              </w:rPr>
+              <w:t xml:space="preserve">Contrastive margin: how much more the prompt resembles a hard bank than an easy bank</w:t>
+            </w:r>
+          </w:p>
+        </w:tc>
+        <w:tc>
+          <w:tcPr>
+            <w:tcW w:type="dxa" w:w="1200"/>
+            <w:tcBorders>
+              <w:top w:val="single" w:color="CCCCCC" w:sz="1"/>
+              <w:left w:val="single" w:color="CCCCCC" w:sz="1"/>
+              <w:bottom w:val="single" w:color="CCCCCC" w:sz="1"/>
+              <w:right w:val="single" w:color="CCCCCC" w:sz="1"/>
+            </w:tcBorders>
+            <w:shd w:fill="FFFFFF" w:val="clear"/>
+            <w:tcMar>
+              <w:top w:type="dxa" w:w="80"/>
+              <w:left w:type="dxa" w:w="120"/>
+              <w:bottom w:type="dxa" w:w="80"/>
+              <w:right w:type="dxa" w:w="120"/>
+            </w:tcMar>
+            <w:vAlign w:val="center"/>
+          </w:tcPr>
+          <w:p>
+            <w:pPr>
+              <w:jc w:val="center"/>
+            </w:pPr>
+            <w:r>
+              <w:rPr>
+                <w:b w:val="false"/>
+                <w:bCs w:val="false"/>
+                <w:sz w:val="20"/>
+                <w:szCs w:val="20"/>
+              </w:rPr>
+              <w:t xml:space="preserve">Yes, two banks</w:t>
+            </w:r>
+          </w:p>
+        </w:tc>
+        <w:tc>
+          <w:tcPr>
+            <w:tcW w:type="dxa" w:w="1500"/>
+            <w:tcBorders>
+              <w:top w:val="single" w:color="CCCCCC" w:sz="1"/>
+              <w:left w:val="single" w:color="CCCCCC" w:sz="1"/>
+              <w:bottom w:val="single" w:color="CCCCCC" w:sz="1"/>
+              <w:right w:val="single" w:color="CCCCCC" w:sz="1"/>
+            </w:tcBorders>
+            <w:shd w:fill="FFFFFF" w:val="clear"/>
+            <w:tcMar>
+              <w:top w:type="dxa" w:w="80"/>
+              <w:left w:type="dxa" w:w="120"/>
+              <w:bottom w:type="dxa" w:w="80"/>
+              <w:right w:type="dxa" w:w="120"/>
+            </w:tcMar>
+            <w:vAlign w:val="center"/>
+          </w:tcPr>
+          <w:p>
+            <w:pPr>
+              <w:jc w:val="center"/>
+            </w:pPr>
+            <w:r>
+              <w:rPr>
+                <w:b w:val="false"/>
+                <w:bCs w:val="false"/>
+                <w:sz w:val="20"/>
+                <w:szCs w:val="20"/>
+              </w:rPr>
+              <w:t xml:space="preserve">When the margin clears its threshold</w:t>
+            </w:r>
+          </w:p>
+        </w:tc>
+      </w:tr>
+      <w:tr>
+        <w:trPr>
+          <w:cantSplit/>
+          <w:tblHeader w:val="false"/>
+        </w:trPr>
+        <w:tc>
+          <w:tcPr>
+            <w:tcW w:type="dxa" w:w="2350"/>
+            <w:tcBorders>
+              <w:top w:val="single" w:color="CCCCCC" w:sz="1"/>
+              <w:left w:val="single" w:color="CCCCCC" w:sz="1"/>
+              <w:bottom w:val="single" w:color="CCCCCC" w:sz="1"/>
+              <w:right w:val="single" w:color="CCCCCC" w:sz="1"/>
+            </w:tcBorders>
+            <w:shd w:fill="FFFFFF" w:val="clear"/>
+            <w:tcMar>
+              <w:top w:type="dxa" w:w="80"/>
+              <w:left w:type="dxa" w:w="120"/>
+              <w:bottom w:type="dxa" w:w="80"/>
+              <w:right w:type="dxa" w:w="120"/>
+            </w:tcMar>
+            <w:vAlign w:val="center"/>
+          </w:tcPr>
+          <w:p>
+            <w:pPr>
+              <w:jc w:val="left"/>
+            </w:pPr>
+            <w:r>
+              <w:rPr>
+                <w:b w:val="false"/>
+                <w:bCs w:val="false"/>
+                <w:sz w:val="20"/>
+                <w:szCs w:val="20"/>
+              </w:rPr>
+              <w:t xml:space="preserve">Embeddings</w:t>
+            </w:r>
+          </w:p>
+        </w:tc>
+        <w:tc>
+          <w:tcPr>
+            <w:tcW w:type="dxa" w:w="4310"/>
+            <w:tcBorders>
+              <w:top w:val="single" w:color="CCCCCC" w:sz="1"/>
+              <w:left w:val="single" w:color="CCCCCC" w:sz="1"/>
+              <w:bottom w:val="single" w:color="CCCCCC" w:sz="1"/>
+              <w:right w:val="single" w:color="CCCCCC" w:sz="1"/>
+            </w:tcBorders>
+            <w:shd w:fill="FFFFFF" w:val="clear"/>
+            <w:tcMar>
+              <w:top w:type="dxa" w:w="80"/>
+              <w:left w:type="dxa" w:w="120"/>
+              <w:bottom w:type="dxa" w:w="80"/>
+              <w:right w:type="dxa" w:w="120"/>
+            </w:tcMar>
+            <w:vAlign w:val="center"/>
+          </w:tcPr>
+          <w:p>
+            <w:pPr>
+              <w:jc w:val="center"/>
+            </w:pPr>
+            <w:r>
+              <w:rPr>
+                <w:b w:val="false"/>
+                <w:bCs w:val="false"/>
+                <w:sz w:val="20"/>
+                <w:szCs w:val="20"/>
+              </w:rPr>
+              <w:t xml:space="preserve">Cosine similarity between the prompt and one bank of example prompts</w:t>
+            </w:r>
+          </w:p>
+        </w:tc>
+        <w:tc>
+          <w:tcPr>
+            <w:tcW w:type="dxa" w:w="1200"/>
+            <w:tcBorders>
+              <w:top w:val="single" w:color="CCCCCC" w:sz="1"/>
+              <w:left w:val="single" w:color="CCCCCC" w:sz="1"/>
+              <w:bottom w:val="single" w:color="CCCCCC" w:sz="1"/>
+              <w:right w:val="single" w:color="CCCCCC" w:sz="1"/>
+            </w:tcBorders>
+            <w:shd w:fill="FFFFFF" w:val="clear"/>
+            <w:tcMar>
+              <w:top w:type="dxa" w:w="80"/>
+              <w:left w:type="dxa" w:w="120"/>
+              <w:bottom w:type="dxa" w:w="80"/>
+              <w:right w:type="dxa" w:w="120"/>
+            </w:tcMar>
+            <w:vAlign w:val="center"/>
+          </w:tcPr>
+          <w:p>
+            <w:pPr>
+              <w:jc w:val="center"/>
+            </w:pPr>
+            <w:r>
+              <w:rPr>
+                <w:b w:val="false"/>
+                <w:bCs w:val="false"/>
+                <w:sz w:val="20"/>
+                <w:szCs w:val="20"/>
+              </w:rPr>
+              <w:t xml:space="preserve">Yes, one bank</w:t>
+            </w:r>
+          </w:p>
+        </w:tc>
+        <w:tc>
+          <w:tcPr>
+            <w:tcW w:type="dxa" w:w="1500"/>
+            <w:tcBorders>
+              <w:top w:val="single" w:color="CCCCCC" w:sz="1"/>
+              <w:left w:val="single" w:color="CCCCCC" w:sz="1"/>
+              <w:bottom w:val="single" w:color="CCCCCC" w:sz="1"/>
+              <w:right w:val="single" w:color="CCCCCC" w:sz="1"/>
+            </w:tcBorders>
+            <w:shd w:fill="FFFFFF" w:val="clear"/>
+            <w:tcMar>
+              <w:top w:type="dxa" w:w="80"/>
+              <w:left w:type="dxa" w:w="120"/>
+              <w:bottom w:type="dxa" w:w="80"/>
+              <w:right w:type="dxa" w:w="120"/>
+            </w:tcMar>
+            <w:vAlign w:val="center"/>
+          </w:tcPr>
+          <w:p>
+            <w:pPr>
+              <w:jc w:val="center"/>
+            </w:pPr>
+            <w:r>
+              <w:rPr>
+                <w:b w:val="false"/>
+                <w:bCs w:val="false"/>
+                <w:sz w:val="20"/>
+                <w:szCs w:val="20"/>
+              </w:rPr>
+              <w:t xml:space="preserve">In proportion to similarity, above a threshold</w:t>
+            </w:r>
+          </w:p>
+        </w:tc>
+      </w:tr>
+      <w:tr>
+        <w:trPr>
+          <w:cantSplit/>
+          <w:tblHeader w:val="false"/>
+        </w:trPr>
+        <w:tc>
+          <w:tcPr>
+            <w:tcW w:type="dxa" w:w="2350"/>
+            <w:tcBorders>
+              <w:top w:val="single" w:color="CCCCCC" w:sz="1"/>
+              <w:left w:val="single" w:color="CCCCCC" w:sz="1"/>
+              <w:bottom w:val="single" w:color="CCCCCC" w:sz="1"/>
+              <w:right w:val="single" w:color="CCCCCC" w:sz="1"/>
+            </w:tcBorders>
+            <w:shd w:fill="FFFFFF" w:val="clear"/>
+            <w:tcMar>
+              <w:top w:type="dxa" w:w="80"/>
+              <w:left w:type="dxa" w:w="120"/>
+              <w:bottom w:type="dxa" w:w="80"/>
+              <w:right w:type="dxa" w:w="120"/>
+            </w:tcMar>
+            <w:vAlign w:val="center"/>
+          </w:tcPr>
+          <w:p>
+            <w:pPr>
+              <w:jc w:val="left"/>
+            </w:pPr>
+            <w:r>
+              <w:rPr>
+                <w:b w:val="false"/>
+                <w:bCs w:val="false"/>
+                <w:sz w:val="20"/>
+                <w:szCs w:val="20"/>
+              </w:rPr>
+              <w:t xml:space="preserve">Structure</w:t>
+            </w:r>
+          </w:p>
+        </w:tc>
+        <w:tc>
+          <w:tcPr>
+            <w:tcW w:type="dxa" w:w="4310"/>
+            <w:tcBorders>
+              <w:top w:val="single" w:color="CCCCCC" w:sz="1"/>
+              <w:left w:val="single" w:color="CCCCCC" w:sz="1"/>
+              <w:bottom w:val="single" w:color="CCCCCC" w:sz="1"/>
+              <w:right w:val="single" w:color="CCCCCC" w:sz="1"/>
+            </w:tcBorders>
+            <w:shd w:fill="FFFFFF" w:val="clear"/>
+            <w:tcMar>
+              <w:top w:type="dxa" w:w="80"/>
+              <w:left w:type="dxa" w:w="120"/>
+              <w:bottom w:type="dxa" w:w="80"/>
+              <w:right w:type="dxa" w:w="120"/>
+            </w:tcMar>
+            <w:vAlign w:val="center"/>
+          </w:tcPr>
+          <w:p>
+            <w:pPr>
+              <w:jc w:val="center"/>
+            </w:pPr>
+            <w:r>
+              <w:rPr>
+                <w:b w:val="false"/>
+                <w:bCs w:val="false"/>
+                <w:sz w:val="20"/>
+                <w:szCs w:val="20"/>
+              </w:rPr>
+              <w:t xml:space="preserve">Mechanical properties of the text: word count, code blocks, numbered lists</w:t>
+            </w:r>
+          </w:p>
+        </w:tc>
+        <w:tc>
+          <w:tcPr>
+            <w:tcW w:type="dxa" w:w="1200"/>
+            <w:tcBorders>
+              <w:top w:val="single" w:color="CCCCCC" w:sz="1"/>
+              <w:left w:val="single" w:color="CCCCCC" w:sz="1"/>
+              <w:bottom w:val="single" w:color="CCCCCC" w:sz="1"/>
+              <w:right w:val="single" w:color="CCCCCC" w:sz="1"/>
+            </w:tcBorders>
+            <w:shd w:fill="FFFFFF" w:val="clear"/>
+            <w:tcMar>
+              <w:top w:type="dxa" w:w="80"/>
+              <w:left w:type="dxa" w:w="120"/>
+              <w:bottom w:type="dxa" w:w="80"/>
+              <w:right w:type="dxa" w:w="120"/>
+            </w:tcMar>
+            <w:vAlign w:val="center"/>
+          </w:tcPr>
+          <w:p>
+            <w:pPr>
+              <w:jc w:val="center"/>
+            </w:pPr>
+            <w:r>
+              <w:rPr>
+                <w:b w:val="false"/>
+                <w:bCs w:val="false"/>
+                <w:sz w:val="20"/>
+                <w:szCs w:val="20"/>
+              </w:rPr>
+              <w:t xml:space="preserve">No</w:t>
+            </w:r>
+          </w:p>
+        </w:tc>
+        <w:tc>
+          <w:tcPr>
+            <w:tcW w:type="dxa" w:w="1500"/>
+            <w:tcBorders>
+              <w:top w:val="single" w:color="CCCCCC" w:sz="1"/>
+              <w:left w:val="single" w:color="CCCCCC" w:sz="1"/>
+              <w:bottom w:val="single" w:color="CCCCCC" w:sz="1"/>
+              <w:right w:val="single" w:color="CCCCCC" w:sz="1"/>
+            </w:tcBorders>
+            <w:shd w:fill="FFFFFF" w:val="clear"/>
+            <w:tcMar>
+              <w:top w:type="dxa" w:w="80"/>
+              <w:left w:type="dxa" w:w="120"/>
+              <w:bottom w:type="dxa" w:w="80"/>
+              <w:right w:type="dxa" w:w="120"/>
+            </w:tcMar>
+            <w:vAlign w:val="center"/>
+          </w:tcPr>
+          <w:p>
+            <w:pPr>
+              <w:jc w:val="center"/>
+            </w:pPr>
+            <w:r>
+              <w:rPr>
+                <w:b w:val="false"/>
+                <w:bCs w:val="false"/>
+                <w:sz w:val="20"/>
+                <w:szCs w:val="20"/>
+              </w:rPr>
+              <w:t xml:space="preserve">Binary, when a regex or length test passes</w:t>
+            </w:r>
+          </w:p>
+        </w:tc>
+      </w:tr>
+      <w:tr>
+        <w:trPr>
+          <w:cantSplit/>
+          <w:tblHeader w:val="false"/>
+        </w:trPr>
+        <w:tc>
+          <w:tcPr>
+            <w:tcW w:type="dxa" w:w="2350"/>
+            <w:tcBorders>
+              <w:top w:val="single" w:color="CCCCCC" w:sz="1"/>
+              <w:left w:val="single" w:color="CCCCCC" w:sz="1"/>
+              <w:bottom w:val="single" w:color="CCCCCC" w:sz="1"/>
+              <w:right w:val="single" w:color="CCCCCC" w:sz="1"/>
+            </w:tcBorders>
+            <w:shd w:fill="FFFFFF" w:val="clear"/>
+            <w:tcMar>
+              <w:top w:type="dxa" w:w="80"/>
+              <w:left w:type="dxa" w:w="120"/>
+              <w:bottom w:type="dxa" w:w="80"/>
+              <w:right w:type="dxa" w:w="120"/>
+            </w:tcMar>
+            <w:vAlign w:val="center"/>
+          </w:tcPr>
+          <w:p>
+            <w:pPr>
+              <w:jc w:val="left"/>
+            </w:pPr>
+            <w:r>
+              <w:rPr>
+                <w:b w:val="false"/>
+                <w:bCs w:val="false"/>
+                <w:sz w:val="20"/>
+                <w:szCs w:val="20"/>
+              </w:rPr>
+              <w:t xml:space="preserve">Context</w:t>
+            </w:r>
+          </w:p>
+        </w:tc>
+        <w:tc>
+          <w:tcPr>
+            <w:tcW w:type="dxa" w:w="4310"/>
+            <w:tcBorders>
+              <w:top w:val="single" w:color="CCCCCC" w:sz="1"/>
+              <w:left w:val="single" w:color="CCCCCC" w:sz="1"/>
+              <w:bottom w:val="single" w:color="CCCCCC" w:sz="1"/>
+              <w:right w:val="single" w:color="CCCCCC" w:sz="1"/>
+            </w:tcBorders>
+            <w:shd w:fill="FFFFFF" w:val="clear"/>
+            <w:tcMar>
+              <w:top w:type="dxa" w:w="80"/>
+              <w:left w:type="dxa" w:w="120"/>
+              <w:bottom w:type="dxa" w:w="80"/>
+              <w:right w:type="dxa" w:w="120"/>
+            </w:tcMar>
+            <w:vAlign w:val="center"/>
+          </w:tcPr>
+          <w:p>
+            <w:pPr>
+              <w:jc w:val="center"/>
+            </w:pPr>
+            <w:r>
+              <w:rPr>
+                <w:b w:val="false"/>
+                <w:bCs w:val="false"/>
+                <w:sz w:val="20"/>
+                <w:szCs w:val="20"/>
+              </w:rPr>
+              <w:t xml:space="preserve">Request facts such as token count or modality</w:t>
+            </w:r>
+          </w:p>
+        </w:tc>
+        <w:tc>
+          <w:tcPr>
+            <w:tcW w:type="dxa" w:w="1200"/>
+            <w:tcBorders>
+              <w:top w:val="single" w:color="CCCCCC" w:sz="1"/>
+              <w:left w:val="single" w:color="CCCCCC" w:sz="1"/>
+              <w:bottom w:val="single" w:color="CCCCCC" w:sz="1"/>
+              <w:right w:val="single" w:color="CCCCCC" w:sz="1"/>
+            </w:tcBorders>
+            <w:shd w:fill="FFFFFF" w:val="clear"/>
+            <w:tcMar>
+              <w:top w:type="dxa" w:w="80"/>
+              <w:left w:type="dxa" w:w="120"/>
+              <w:bottom w:type="dxa" w:w="80"/>
+              <w:right w:type="dxa" w:w="120"/>
+            </w:tcMar>
+            <w:vAlign w:val="center"/>
+          </w:tcPr>
+          <w:p>
+            <w:pPr>
+              <w:jc w:val="center"/>
+            </w:pPr>
+            <w:r>
+              <w:rPr>
+                <w:b w:val="false"/>
+                <w:bCs w:val="false"/>
+                <w:sz w:val="20"/>
+                <w:szCs w:val="20"/>
+              </w:rPr>
+              <w:t xml:space="preserve">No</w:t>
+            </w:r>
+          </w:p>
+        </w:tc>
+        <w:tc>
+          <w:tcPr>
+            <w:tcW w:type="dxa" w:w="1500"/>
+            <w:tcBorders>
+              <w:top w:val="single" w:color="CCCCCC" w:sz="1"/>
+              <w:left w:val="single" w:color="CCCCCC" w:sz="1"/>
+              <w:bottom w:val="single" w:color="CCCCCC" w:sz="1"/>
+              <w:right w:val="single" w:color="CCCCCC" w:sz="1"/>
+            </w:tcBorders>
+            <w:shd w:fill="FFFFFF" w:val="clear"/>
+            <w:tcMar>
+              <w:top w:type="dxa" w:w="80"/>
+              <w:left w:type="dxa" w:w="120"/>
+              <w:bottom w:type="dxa" w:w="80"/>
+              <w:right w:type="dxa" w:w="120"/>
+            </w:tcMar>
+            <w:vAlign w:val="center"/>
+          </w:tcPr>
+          <w:p>
+            <w:pPr>
+              <w:jc w:val="center"/>
+            </w:pPr>
+            <w:r>
+              <w:rPr>
+                <w:b w:val="false"/>
+                <w:bCs w:val="false"/>
+                <w:sz w:val="20"/>
+                <w:szCs w:val="20"/>
+              </w:rPr>
+              <w:t xml:space="preserve">Binary, when the value falls in range</w:t>
+            </w:r>
+          </w:p>
+        </w:tc>
+      </w:tr>
+    </w:tbl>
+    <w:p>
+      <w:pPr>
+        <w:spacing w:after="120"/>
+      </w:pPr>
+      <w:r>
+        <w:t xml:space="preserve"/>
       </w:r>
     </w:p>
     <w:p>
       <w:pPr>
         <w:spacing w:after="160" w:line="276"/>
         <w:jc w:val="both"/>
+      </w:pPr>
+      <w:r>
+        <w:t xml:space="preserve">Complexity, structure, and context contribute in an on-or-off way: when the signal fires, it adds its weight to the score, otherwise it adds nothing. Embedding signals contribute continuously, in proportion to how closely the prompt matches their bank. A weight can be negative. A signal with a negative weight is a detractor: when it fires it pulls the score down, which is how trivial questions are anchored in the cheapest tier rather than drifting upward.</w:t>
+      </w:r>
+    </w:p>
+    <w:p>
+      <w:pPr>
+        <w:spacing w:after="160" w:line="276"/>
+        <w:jc w:val="both"/>
+      </w:pPr>
+      <w:r>
+        <w:t xml:space="preserve">The configuration documented here uses one complexity signal, four embedding signals, several structure signals, and one context signal. The embedding signals are where most of the routing intelligence lives, so they are worth listing with their weights:</w:t>
+      </w:r>
+    </w:p>
+    <w:tbl>
+      <w:tblPr>
+        <w:tblW w:type="dxa" w:w="9360"/>
+        <w:tblBorders>
+          <w:top w:val="single" w:color="auto" w:sz="4"/>
+          <w:left w:val="single" w:color="auto" w:sz="4"/>
+          <w:bottom w:val="single" w:color="auto" w:sz="4"/>
+          <w:right w:val="single" w:color="auto" w:sz="4"/>
+          <w:insideH w:val="single" w:color="auto" w:sz="4"/>
+          <w:insideV w:val="single" w:color="auto" w:sz="4"/>
+        </w:tblBorders>
+      </w:tblPr>
+      <w:tblGrid>
+        <w:gridCol w:w="2900"/>
+        <w:gridCol w:w="1300"/>
+        <w:gridCol w:w="5160"/>
+      </w:tblGrid>
+      <w:tr>
+        <w:trPr>
+          <w:cantSplit/>
+          <w:tblHeader/>
+        </w:trPr>
+        <w:tc>
+          <w:tcPr>
+            <w:tcW w:type="dxa" w:w="2900"/>
+            <w:tcBorders>
+              <w:top w:val="single" w:color="CCCCCC" w:sz="1"/>
+              <w:left w:val="single" w:color="CCCCCC" w:sz="1"/>
+              <w:bottom w:val="single" w:color="CCCCCC" w:sz="1"/>
+              <w:right w:val="single" w:color="CCCCCC" w:sz="1"/>
+            </w:tcBorders>
+            <w:shd w:fill="d5e8f0" w:val="clear"/>
+            <w:tcMar>
+              <w:top w:type="dxa" w:w="80"/>
+              <w:left w:type="dxa" w:w="120"/>
+              <w:bottom w:type="dxa" w:w="80"/>
+              <w:right w:type="dxa" w:w="120"/>
+            </w:tcMar>
+            <w:vAlign w:val="center"/>
+          </w:tcPr>
+          <w:p>
+            <w:pPr>
+              <w:jc w:val="left"/>
+            </w:pPr>
+            <w:r>
+              <w:rPr>
+                <w:b/>
+                <w:bCs/>
+                <w:sz w:val="20"/>
+                <w:szCs w:val="20"/>
+              </w:rPr>
+              <w:t xml:space="preserve">Embedding signal</w:t>
+            </w:r>
+          </w:p>
+        </w:tc>
+        <w:tc>
+          <w:tcPr>
+            <w:tcW w:type="dxa" w:w="1300"/>
+            <w:tcBorders>
+              <w:top w:val="single" w:color="CCCCCC" w:sz="1"/>
+              <w:left w:val="single" w:color="CCCCCC" w:sz="1"/>
+              <w:bottom w:val="single" w:color="CCCCCC" w:sz="1"/>
+              <w:right w:val="single" w:color="CCCCCC" w:sz="1"/>
+            </w:tcBorders>
+            <w:shd w:fill="d5e8f0" w:val="clear"/>
+            <w:tcMar>
+              <w:top w:type="dxa" w:w="80"/>
+              <w:left w:type="dxa" w:w="120"/>
+              <w:bottom w:type="dxa" w:w="80"/>
+              <w:right w:type="dxa" w:w="120"/>
+            </w:tcMar>
+            <w:vAlign w:val="center"/>
+          </w:tcPr>
+          <w:p>
+            <w:pPr>
+              <w:jc w:val="center"/>
+            </w:pPr>
+            <w:r>
+              <w:rPr>
+                <w:b/>
+                <w:bCs/>
+                <w:sz w:val="20"/>
+                <w:szCs w:val="20"/>
+              </w:rPr>
+              <w:t xml:space="preserve">Weight</w:t>
+            </w:r>
+          </w:p>
+        </w:tc>
+        <w:tc>
+          <w:tcPr>
+            <w:tcW w:type="dxa" w:w="5160"/>
+            <w:tcBorders>
+              <w:top w:val="single" w:color="CCCCCC" w:sz="1"/>
+              <w:left w:val="single" w:color="CCCCCC" w:sz="1"/>
+              <w:bottom w:val="single" w:color="CCCCCC" w:sz="1"/>
+              <w:right w:val="single" w:color="CCCCCC" w:sz="1"/>
+            </w:tcBorders>
+            <w:shd w:fill="d5e8f0" w:val="clear"/>
+            <w:tcMar>
+              <w:top w:type="dxa" w:w="80"/>
+              <w:left w:type="dxa" w:w="120"/>
+              <w:bottom w:type="dxa" w:w="80"/>
+              <w:right w:type="dxa" w:w="120"/>
+            </w:tcMar>
+            <w:vAlign w:val="center"/>
+          </w:tcPr>
+          <w:p>
+            <w:pPr>
+              <w:jc w:val="center"/>
+            </w:pPr>
+            <w:r>
+              <w:rPr>
+                <w:b/>
+                <w:bCs/>
+                <w:sz w:val="20"/>
+                <w:szCs w:val="20"/>
+              </w:rPr>
+              <w:t xml:space="preserve">What it captures</w:t>
+            </w:r>
+          </w:p>
+        </w:tc>
+      </w:tr>
+      <w:tr>
+        <w:trPr>
+          <w:cantSplit/>
+          <w:tblHeader w:val="false"/>
+        </w:trPr>
+        <w:tc>
+          <w:tcPr>
+            <w:tcW w:type="dxa" w:w="2900"/>
+            <w:tcBorders>
+              <w:top w:val="single" w:color="CCCCCC" w:sz="1"/>
+              <w:left w:val="single" w:color="CCCCCC" w:sz="1"/>
+              <w:bottom w:val="single" w:color="CCCCCC" w:sz="1"/>
+              <w:right w:val="single" w:color="CCCCCC" w:sz="1"/>
+            </w:tcBorders>
+            <w:shd w:fill="FFFFFF" w:val="clear"/>
+            <w:tcMar>
+              <w:top w:type="dxa" w:w="80"/>
+              <w:left w:type="dxa" w:w="120"/>
+              <w:bottom w:type="dxa" w:w="80"/>
+              <w:right w:type="dxa" w:w="120"/>
+            </w:tcMar>
+            <w:vAlign w:val="center"/>
+          </w:tcPr>
+          <w:p>
+            <w:pPr>
+              <w:jc w:val="left"/>
+            </w:pPr>
+            <w:r>
+              <w:rPr>
+                <w:b w:val="false"/>
+                <w:bCs w:val="false"/>
+                <w:sz w:val="20"/>
+                <w:szCs w:val="20"/>
+              </w:rPr>
+              <w:t xml:space="preserve">trivial_lookup</w:t>
+            </w:r>
+          </w:p>
+        </w:tc>
+        <w:tc>
+          <w:tcPr>
+            <w:tcW w:type="dxa" w:w="1300"/>
+            <w:tcBorders>
+              <w:top w:val="single" w:color="CCCCCC" w:sz="1"/>
+              <w:left w:val="single" w:color="CCCCCC" w:sz="1"/>
+              <w:bottom w:val="single" w:color="CCCCCC" w:sz="1"/>
+              <w:right w:val="single" w:color="CCCCCC" w:sz="1"/>
+            </w:tcBorders>
+            <w:shd w:fill="FFFFFF" w:val="clear"/>
+            <w:tcMar>
+              <w:top w:type="dxa" w:w="80"/>
+              <w:left w:type="dxa" w:w="120"/>
+              <w:bottom w:type="dxa" w:w="80"/>
+              <w:right w:type="dxa" w:w="120"/>
+            </w:tcMar>
+            <w:vAlign w:val="center"/>
+          </w:tcPr>
+          <w:p>
+            <w:pPr>
+              <w:jc w:val="center"/>
+            </w:pPr>
+            <w:r>
+              <w:rPr>
+                <w:b w:val="false"/>
+                <w:bCs w:val="false"/>
+                <w:sz w:val="20"/>
+                <w:szCs w:val="20"/>
+              </w:rPr>
+              <w:t xml:space="preserve">-0.20</w:t>
+            </w:r>
+          </w:p>
+        </w:tc>
+        <w:tc>
+          <w:tcPr>
+            <w:tcW w:type="dxa" w:w="5160"/>
+            <w:tcBorders>
+              <w:top w:val="single" w:color="CCCCCC" w:sz="1"/>
+              <w:left w:val="single" w:color="CCCCCC" w:sz="1"/>
+              <w:bottom w:val="single" w:color="CCCCCC" w:sz="1"/>
+              <w:right w:val="single" w:color="CCCCCC" w:sz="1"/>
+            </w:tcBorders>
+            <w:shd w:fill="FFFFFF" w:val="clear"/>
+            <w:tcMar>
+              <w:top w:type="dxa" w:w="80"/>
+              <w:left w:type="dxa" w:w="120"/>
+              <w:bottom w:type="dxa" w:w="80"/>
+              <w:right w:type="dxa" w:w="120"/>
+            </w:tcMar>
+            <w:vAlign w:val="center"/>
+          </w:tcPr>
+          <w:p>
+            <w:pPr>
+              <w:jc w:val="center"/>
+            </w:pPr>
+            <w:r>
+              <w:rPr>
+                <w:b w:val="false"/>
+                <w:bCs w:val="false"/>
+                <w:sz w:val="20"/>
+                <w:szCs w:val="20"/>
+              </w:rPr>
+              <w:t xml:space="preserve">Short factual asks and definitions. A detractor that pulls difficulty down and anchors easy queries at T1.</w:t>
+            </w:r>
+          </w:p>
+        </w:tc>
+      </w:tr>
+      <w:tr>
+        <w:trPr>
+          <w:cantSplit/>
+          <w:tblHeader w:val="false"/>
+        </w:trPr>
+        <w:tc>
+          <w:tcPr>
+            <w:tcW w:type="dxa" w:w="2900"/>
+            <w:tcBorders>
+              <w:top w:val="single" w:color="CCCCCC" w:sz="1"/>
+              <w:left w:val="single" w:color="CCCCCC" w:sz="1"/>
+              <w:bottom w:val="single" w:color="CCCCCC" w:sz="1"/>
+              <w:right w:val="single" w:color="CCCCCC" w:sz="1"/>
+            </w:tcBorders>
+            <w:shd w:fill="FFFFFF" w:val="clear"/>
+            <w:tcMar>
+              <w:top w:type="dxa" w:w="80"/>
+              <w:left w:type="dxa" w:w="120"/>
+              <w:bottom w:type="dxa" w:w="80"/>
+              <w:right w:type="dxa" w:w="120"/>
+            </w:tcMar>
+            <w:vAlign w:val="center"/>
+          </w:tcPr>
+          <w:p>
+            <w:pPr>
+              <w:jc w:val="left"/>
+            </w:pPr>
+            <w:r>
+              <w:rPr>
+                <w:b w:val="false"/>
+                <w:bCs w:val="false"/>
+                <w:sz w:val="20"/>
+                <w:szCs w:val="20"/>
+              </w:rPr>
+              <w:t xml:space="preserve">moderate_complexity</w:t>
+            </w:r>
+          </w:p>
+        </w:tc>
+        <w:tc>
+          <w:tcPr>
+            <w:tcW w:type="dxa" w:w="1300"/>
+            <w:tcBorders>
+              <w:top w:val="single" w:color="CCCCCC" w:sz="1"/>
+              <w:left w:val="single" w:color="CCCCCC" w:sz="1"/>
+              <w:bottom w:val="single" w:color="CCCCCC" w:sz="1"/>
+              <w:right w:val="single" w:color="CCCCCC" w:sz="1"/>
+            </w:tcBorders>
+            <w:shd w:fill="FFFFFF" w:val="clear"/>
+            <w:tcMar>
+              <w:top w:type="dxa" w:w="80"/>
+              <w:left w:type="dxa" w:w="120"/>
+              <w:bottom w:type="dxa" w:w="80"/>
+              <w:right w:type="dxa" w:w="120"/>
+            </w:tcMar>
+            <w:vAlign w:val="center"/>
+          </w:tcPr>
+          <w:p>
+            <w:pPr>
+              <w:jc w:val="center"/>
+            </w:pPr>
+            <w:r>
+              <w:rPr>
+                <w:b w:val="false"/>
+                <w:bCs w:val="false"/>
+                <w:sz w:val="20"/>
+                <w:szCs w:val="20"/>
+              </w:rPr>
+              <w:t xml:space="preserve">+0.22</w:t>
+            </w:r>
+          </w:p>
+        </w:tc>
+        <w:tc>
+          <w:tcPr>
+            <w:tcW w:type="dxa" w:w="5160"/>
+            <w:tcBorders>
+              <w:top w:val="single" w:color="CCCCCC" w:sz="1"/>
+              <w:left w:val="single" w:color="CCCCCC" w:sz="1"/>
+              <w:bottom w:val="single" w:color="CCCCCC" w:sz="1"/>
+              <w:right w:val="single" w:color="CCCCCC" w:sz="1"/>
+            </w:tcBorders>
+            <w:shd w:fill="FFFFFF" w:val="clear"/>
+            <w:tcMar>
+              <w:top w:type="dxa" w:w="80"/>
+              <w:left w:type="dxa" w:w="120"/>
+              <w:bottom w:type="dxa" w:w="80"/>
+              <w:right w:type="dxa" w:w="120"/>
+            </w:tcMar>
+            <w:vAlign w:val="center"/>
+          </w:tcPr>
+          <w:p>
+            <w:pPr>
+              <w:jc w:val="center"/>
+            </w:pPr>
+            <w:r>
+              <w:rPr>
+                <w:b w:val="false"/>
+                <w:bCs w:val="false"/>
+                <w:sz w:val="20"/>
+                <w:szCs w:val="20"/>
+              </w:rPr>
+              <w:t xml:space="preserve">Explain-how, compare-and-contrast, and basic-implementation prompts that belong in T2 or T3.</w:t>
+            </w:r>
+          </w:p>
+        </w:tc>
+      </w:tr>
+      <w:tr>
+        <w:trPr>
+          <w:cantSplit/>
+          <w:tblHeader w:val="false"/>
+        </w:trPr>
+        <w:tc>
+          <w:tcPr>
+            <w:tcW w:type="dxa" w:w="2900"/>
+            <w:tcBorders>
+              <w:top w:val="single" w:color="CCCCCC" w:sz="1"/>
+              <w:left w:val="single" w:color="CCCCCC" w:sz="1"/>
+              <w:bottom w:val="single" w:color="CCCCCC" w:sz="1"/>
+              <w:right w:val="single" w:color="CCCCCC" w:sz="1"/>
+            </w:tcBorders>
+            <w:shd w:fill="FFFFFF" w:val="clear"/>
+            <w:tcMar>
+              <w:top w:type="dxa" w:w="80"/>
+              <w:left w:type="dxa" w:w="120"/>
+              <w:bottom w:type="dxa" w:w="80"/>
+              <w:right w:type="dxa" w:w="120"/>
+            </w:tcMar>
+            <w:vAlign w:val="center"/>
+          </w:tcPr>
+          <w:p>
+            <w:pPr>
+              <w:jc w:val="left"/>
+            </w:pPr>
+            <w:r>
+              <w:rPr>
+                <w:b w:val="false"/>
+                <w:bCs w:val="false"/>
+                <w:sz w:val="20"/>
+                <w:szCs w:val="20"/>
+              </w:rPr>
+              <w:t xml:space="preserve">argumentative_construction</w:t>
+            </w:r>
+          </w:p>
+        </w:tc>
+        <w:tc>
+          <w:tcPr>
+            <w:tcW w:type="dxa" w:w="1300"/>
+            <w:tcBorders>
+              <w:top w:val="single" w:color="CCCCCC" w:sz="1"/>
+              <w:left w:val="single" w:color="CCCCCC" w:sz="1"/>
+              <w:bottom w:val="single" w:color="CCCCCC" w:sz="1"/>
+              <w:right w:val="single" w:color="CCCCCC" w:sz="1"/>
+            </w:tcBorders>
+            <w:shd w:fill="FFFFFF" w:val="clear"/>
+            <w:tcMar>
+              <w:top w:type="dxa" w:w="80"/>
+              <w:left w:type="dxa" w:w="120"/>
+              <w:bottom w:type="dxa" w:w="80"/>
+              <w:right w:type="dxa" w:w="120"/>
+            </w:tcMar>
+            <w:vAlign w:val="center"/>
+          </w:tcPr>
+          <w:p>
+            <w:pPr>
+              <w:jc w:val="center"/>
+            </w:pPr>
+            <w:r>
+              <w:rPr>
+                <w:b w:val="false"/>
+                <w:bCs w:val="false"/>
+                <w:sz w:val="20"/>
+                <w:szCs w:val="20"/>
+              </w:rPr>
+              <w:t xml:space="preserve">+0.18</w:t>
+            </w:r>
+          </w:p>
+        </w:tc>
+        <w:tc>
+          <w:tcPr>
+            <w:tcW w:type="dxa" w:w="5160"/>
+            <w:tcBorders>
+              <w:top w:val="single" w:color="CCCCCC" w:sz="1"/>
+              <w:left w:val="single" w:color="CCCCCC" w:sz="1"/>
+              <w:bottom w:val="single" w:color="CCCCCC" w:sz="1"/>
+              <w:right w:val="single" w:color="CCCCCC" w:sz="1"/>
+            </w:tcBorders>
+            <w:shd w:fill="FFFFFF" w:val="clear"/>
+            <w:tcMar>
+              <w:top w:type="dxa" w:w="80"/>
+              <w:left w:type="dxa" w:w="120"/>
+              <w:bottom w:type="dxa" w:w="80"/>
+              <w:right w:type="dxa" w:w="120"/>
+            </w:tcMar>
+            <w:vAlign w:val="center"/>
+          </w:tcPr>
+          <w:p>
+            <w:pPr>
+              <w:jc w:val="center"/>
+            </w:pPr>
+            <w:r>
+              <w:rPr>
+                <w:b w:val="false"/>
+                <w:bCs w:val="false"/>
+                <w:sz w:val="20"/>
+                <w:szCs w:val="20"/>
+              </w:rPr>
+              <w:t xml:space="preserve">Prompts that demand a position, recommendation, or diagnosis, the T4 judgment pattern.</w:t>
+            </w:r>
+          </w:p>
+        </w:tc>
+      </w:tr>
+      <w:tr>
+        <w:trPr>
+          <w:cantSplit/>
+          <w:tblHeader w:val="false"/>
+        </w:trPr>
+        <w:tc>
+          <w:tcPr>
+            <w:tcW w:type="dxa" w:w="2900"/>
+            <w:tcBorders>
+              <w:top w:val="single" w:color="CCCCCC" w:sz="1"/>
+              <w:left w:val="single" w:color="CCCCCC" w:sz="1"/>
+              <w:bottom w:val="single" w:color="CCCCCC" w:sz="1"/>
+              <w:right w:val="single" w:color="CCCCCC" w:sz="1"/>
+            </w:tcBorders>
+            <w:shd w:fill="FFFFFF" w:val="clear"/>
+            <w:tcMar>
+              <w:top w:type="dxa" w:w="80"/>
+              <w:left w:type="dxa" w:w="120"/>
+              <w:bottom w:type="dxa" w:w="80"/>
+              <w:right w:type="dxa" w:w="120"/>
+            </w:tcMar>
+            <w:vAlign w:val="center"/>
+          </w:tcPr>
+          <w:p>
+            <w:pPr>
+              <w:jc w:val="left"/>
+            </w:pPr>
+            <w:r>
+              <w:rPr>
+                <w:b w:val="false"/>
+                <w:bCs w:val="false"/>
+                <w:sz w:val="20"/>
+                <w:szCs w:val="20"/>
+              </w:rPr>
+              <w:t xml:space="preserve">frontier_synthesis</w:t>
+            </w:r>
+          </w:p>
+        </w:tc>
+        <w:tc>
+          <w:tcPr>
+            <w:tcW w:type="dxa" w:w="1300"/>
+            <w:tcBorders>
+              <w:top w:val="single" w:color="CCCCCC" w:sz="1"/>
+              <w:left w:val="single" w:color="CCCCCC" w:sz="1"/>
+              <w:bottom w:val="single" w:color="CCCCCC" w:sz="1"/>
+              <w:right w:val="single" w:color="CCCCCC" w:sz="1"/>
+            </w:tcBorders>
+            <w:shd w:fill="FFFFFF" w:val="clear"/>
+            <w:tcMar>
+              <w:top w:type="dxa" w:w="80"/>
+              <w:left w:type="dxa" w:w="120"/>
+              <w:bottom w:type="dxa" w:w="80"/>
+              <w:right w:type="dxa" w:w="120"/>
+            </w:tcMar>
+            <w:vAlign w:val="center"/>
+          </w:tcPr>
+          <w:p>
+            <w:pPr>
+              <w:jc w:val="center"/>
+            </w:pPr>
+            <w:r>
+              <w:rPr>
+                <w:b w:val="false"/>
+                <w:bCs w:val="false"/>
+                <w:sz w:val="20"/>
+                <w:szCs w:val="20"/>
+              </w:rPr>
+              <w:t xml:space="preserve">+0.15</w:t>
+            </w:r>
+          </w:p>
+        </w:tc>
+        <w:tc>
+          <w:tcPr>
+            <w:tcW w:type="dxa" w:w="5160"/>
+            <w:tcBorders>
+              <w:top w:val="single" w:color="CCCCCC" w:sz="1"/>
+              <w:left w:val="single" w:color="CCCCCC" w:sz="1"/>
+              <w:bottom w:val="single" w:color="CCCCCC" w:sz="1"/>
+              <w:right w:val="single" w:color="CCCCCC" w:sz="1"/>
+            </w:tcBorders>
+            <w:shd w:fill="FFFFFF" w:val="clear"/>
+            <w:tcMar>
+              <w:top w:type="dxa" w:w="80"/>
+              <w:left w:type="dxa" w:w="120"/>
+              <w:bottom w:type="dxa" w:w="80"/>
+              <w:right w:type="dxa" w:w="120"/>
+            </w:tcMar>
+            <w:vAlign w:val="center"/>
+          </w:tcPr>
+          <w:p>
+            <w:pPr>
+              <w:jc w:val="center"/>
+            </w:pPr>
+            <w:r>
+              <w:rPr>
+                <w:b w:val="false"/>
+                <w:bCs w:val="false"/>
+                <w:sz w:val="20"/>
+                <w:szCs w:val="20"/>
+              </w:rPr>
+              <w:t xml:space="preserve">Long-form original argument and multi-domain synthesis, the T5 pattern.</w:t>
+            </w:r>
+          </w:p>
+        </w:tc>
+      </w:tr>
+    </w:tbl>
+    <w:p>
+      <w:pPr>
+        <w:spacing w:after="120"/>
+      </w:pPr>
+      <w:r>
+        <w:t xml:space="preserve"/>
+      </w:r>
+    </w:p>
+    <w:p>
+      <w:pPr>
+        <w:spacing w:after="160" w:line="276"/>
+        <w:jc w:val="both"/>
+      </w:pPr>
+      <w:r>
+        <w:t xml:space="preserve">The single complexity signal, </w:t>
+      </w:r>
+      <w:r>
+        <w:rPr>
+          <w:rFonts w:ascii="Courier New" w:cs="Courier New" w:eastAsia="Courier New" w:hAnsi="Courier New"/>
+        </w:rPr>
+        <w:t xml:space="preserve">query_difficulty</w:t>
+      </w:r>
+      <w:r>
+        <w:t xml:space="preserve">, carries a weight of +0.24 and contrasts diverse hard archetypes against diverse trivial ones. The structure signals add small mechanical adjustments: a prompt under twelve words subtracts a little, a prompt over twenty-five words adds a little, a fenced code block or a numbered list adds a little. The context signal adds weight when the request needs a large context window. None of these is doing anything subtle on its own. Their value is in the sum.</w:t>
+      </w:r>
+    </w:p>
+    <w:p>
+      <w:pPr>
+        <w:pStyle w:val="Heading2"/>
+      </w:pPr>
+      <w:r>
+        <w:t xml:space="preserve">5.4 Writing exemplars</w:t>
+      </w:r>
+    </w:p>
+    <w:p>
+      <w:pPr>
+        <w:spacing w:after="160" w:line="276"/>
+        <w:jc w:val="both"/>
+      </w:pPr>
+      <w:r>
+        <w:t xml:space="preserve">An exemplar is simply an example prompt you place in a bank. The router converts each one into a vector, and when a new prompt arrives it compares that prompt to the bank by similarity. You are teaching by example: this bank says “questions that look like these are hard,” that bank says “questions that look like these are trivial.” Because the banks are what the router actually compares against, the quality of your exemplars determines the quality of your routing. A small example of the two banks behind a complexity signal:</w:t>
+      </w:r>
+    </w:p>
+    <w:tbl>
+      <w:tblPr>
+        <w:tblW w:type="dxa" w:w="9360"/>
+        <w:tblBorders>
+          <w:top w:val="single" w:color="auto" w:sz="4"/>
+          <w:left w:val="single" w:color="auto" w:sz="4"/>
+          <w:bottom w:val="single" w:color="auto" w:sz="4"/>
+          <w:right w:val="single" w:color="auto" w:sz="4"/>
+          <w:insideH w:val="single" w:color="auto" w:sz="4"/>
+          <w:insideV w:val="single" w:color="auto" w:sz="4"/>
+        </w:tblBorders>
+      </w:tblPr>
+      <w:tblGrid>
+        <w:gridCol w:w="4680"/>
+        <w:gridCol w:w="4680"/>
+      </w:tblGrid>
+      <w:tr>
+        <w:trPr>
+          <w:cantSplit/>
+          <w:tblHeader/>
+        </w:trPr>
+        <w:tc>
+          <w:tcPr>
+            <w:tcW w:type="dxa" w:w="4680"/>
+            <w:tcBorders>
+              <w:top w:val="single" w:color="CCCCCC" w:sz="1"/>
+              <w:left w:val="single" w:color="CCCCCC" w:sz="1"/>
+              <w:bottom w:val="single" w:color="CCCCCC" w:sz="1"/>
+              <w:right w:val="single" w:color="CCCCCC" w:sz="1"/>
+            </w:tcBorders>
+            <w:shd w:fill="d5e8f0" w:val="clear"/>
+            <w:tcMar>
+              <w:top w:type="dxa" w:w="80"/>
+              <w:left w:type="dxa" w:w="120"/>
+              <w:bottom w:type="dxa" w:w="80"/>
+              <w:right w:type="dxa" w:w="120"/>
+            </w:tcMar>
+            <w:vAlign w:val="center"/>
+          </w:tcPr>
+          <w:p>
+            <w:pPr>
+              <w:jc w:val="left"/>
+            </w:pPr>
+            <w:r>
+              <w:rPr>
+                <w:b/>
+                <w:bCs/>
+                <w:sz w:val="20"/>
+                <w:szCs w:val="20"/>
+              </w:rPr>
+              <w:t xml:space="preserve">Hard bank (raises difficulty)</w:t>
+            </w:r>
+          </w:p>
+        </w:tc>
+        <w:tc>
+          <w:tcPr>
+            <w:tcW w:type="dxa" w:w="4680"/>
+            <w:tcBorders>
+              <w:top w:val="single" w:color="CCCCCC" w:sz="1"/>
+              <w:left w:val="single" w:color="CCCCCC" w:sz="1"/>
+              <w:bottom w:val="single" w:color="CCCCCC" w:sz="1"/>
+              <w:right w:val="single" w:color="CCCCCC" w:sz="1"/>
+            </w:tcBorders>
+            <w:shd w:fill="d5e8f0" w:val="clear"/>
+            <w:tcMar>
+              <w:top w:type="dxa" w:w="80"/>
+              <w:left w:type="dxa" w:w="120"/>
+              <w:bottom w:type="dxa" w:w="80"/>
+              <w:right w:type="dxa" w:w="120"/>
+            </w:tcMar>
+            <w:vAlign w:val="center"/>
+          </w:tcPr>
+          <w:p>
+            <w:pPr>
+              <w:jc w:val="center"/>
+            </w:pPr>
+            <w:r>
+              <w:rPr>
+                <w:b/>
+                <w:bCs/>
+                <w:sz w:val="20"/>
+                <w:szCs w:val="20"/>
+              </w:rPr>
+              <w:t xml:space="preserve">Easy bank (lowers difficulty)</w:t>
+            </w:r>
+          </w:p>
+        </w:tc>
+      </w:tr>
+      <w:tr>
+        <w:trPr>
+          <w:cantSplit/>
+          <w:tblHeader w:val="false"/>
+        </w:trPr>
+        <w:tc>
+          <w:tcPr>
+            <w:tcW w:type="dxa" w:w="4680"/>
+            <w:tcBorders>
+              <w:top w:val="single" w:color="CCCCCC" w:sz="1"/>
+              <w:left w:val="single" w:color="CCCCCC" w:sz="1"/>
+              <w:bottom w:val="single" w:color="CCCCCC" w:sz="1"/>
+              <w:right w:val="single" w:color="CCCCCC" w:sz="1"/>
+            </w:tcBorders>
+            <w:shd w:fill="FFFFFF" w:val="clear"/>
+            <w:tcMar>
+              <w:top w:type="dxa" w:w="80"/>
+              <w:left w:type="dxa" w:w="120"/>
+              <w:bottom w:type="dxa" w:w="80"/>
+              <w:right w:type="dxa" w:w="120"/>
+            </w:tcMar>
+            <w:vAlign w:val="center"/>
+          </w:tcPr>
+          <w:p>
+            <w:pPr>
+              <w:jc w:val="left"/>
+            </w:pPr>
+            <w:r>
+              <w:rPr>
+                <w:b w:val="false"/>
+                <w:bCs w:val="false"/>
+                <w:sz w:val="20"/>
+                <w:szCs w:val="20"/>
+              </w:rPr>
+              <w:t xml:space="preserve">Demonstrate that there are infinitely many primes.</w:t>
+            </w:r>
+          </w:p>
+        </w:tc>
+        <w:tc>
+          <w:tcPr>
+            <w:tcW w:type="dxa" w:w="4680"/>
+            <w:tcBorders>
+              <w:top w:val="single" w:color="CCCCCC" w:sz="1"/>
+              <w:left w:val="single" w:color="CCCCCC" w:sz="1"/>
+              <w:bottom w:val="single" w:color="CCCCCC" w:sz="1"/>
+              <w:right w:val="single" w:color="CCCCCC" w:sz="1"/>
+            </w:tcBorders>
+            <w:shd w:fill="FFFFFF" w:val="clear"/>
+            <w:tcMar>
+              <w:top w:type="dxa" w:w="80"/>
+              <w:left w:type="dxa" w:w="120"/>
+              <w:bottom w:type="dxa" w:w="80"/>
+              <w:right w:type="dxa" w:w="120"/>
+            </w:tcMar>
+            <w:vAlign w:val="center"/>
+          </w:tcPr>
+          <w:p>
+            <w:pPr>
+              <w:jc w:val="center"/>
+            </w:pPr>
+            <w:r>
+              <w:rPr>
+                <w:b w:val="false"/>
+                <w:bCs w:val="false"/>
+                <w:sz w:val="20"/>
+                <w:szCs w:val="20"/>
+              </w:rPr>
+              <w:t xml:space="preserve">What is the chemical symbol for sodium?</w:t>
+            </w:r>
+          </w:p>
+        </w:tc>
+      </w:tr>
+      <w:tr>
+        <w:trPr>
+          <w:cantSplit/>
+          <w:tblHeader w:val="false"/>
+        </w:trPr>
+        <w:tc>
+          <w:tcPr>
+            <w:tcW w:type="dxa" w:w="4680"/>
+            <w:tcBorders>
+              <w:top w:val="single" w:color="CCCCCC" w:sz="1"/>
+              <w:left w:val="single" w:color="CCCCCC" w:sz="1"/>
+              <w:bottom w:val="single" w:color="CCCCCC" w:sz="1"/>
+              <w:right w:val="single" w:color="CCCCCC" w:sz="1"/>
+            </w:tcBorders>
+            <w:shd w:fill="FFFFFF" w:val="clear"/>
+            <w:tcMar>
+              <w:top w:type="dxa" w:w="80"/>
+              <w:left w:type="dxa" w:w="120"/>
+              <w:bottom w:type="dxa" w:w="80"/>
+              <w:right w:type="dxa" w:w="120"/>
+            </w:tcMar>
+            <w:vAlign w:val="center"/>
+          </w:tcPr>
+          <w:p>
+            <w:pPr>
+              <w:jc w:val="left"/>
+            </w:pPr>
+            <w:r>
+              <w:rPr>
+                <w:b w:val="false"/>
+                <w:bCs w:val="false"/>
+                <w:sz w:val="20"/>
+                <w:szCs w:val="20"/>
+              </w:rPr>
+              <w:t xml:space="preserve">Walk through how Raft handles a split-vote scenario.</w:t>
+            </w:r>
+          </w:p>
+        </w:tc>
+        <w:tc>
+          <w:tcPr>
+            <w:tcW w:type="dxa" w:w="4680"/>
+            <w:tcBorders>
+              <w:top w:val="single" w:color="CCCCCC" w:sz="1"/>
+              <w:left w:val="single" w:color="CCCCCC" w:sz="1"/>
+              <w:bottom w:val="single" w:color="CCCCCC" w:sz="1"/>
+              <w:right w:val="single" w:color="CCCCCC" w:sz="1"/>
+            </w:tcBorders>
+            <w:shd w:fill="FFFFFF" w:val="clear"/>
+            <w:tcMar>
+              <w:top w:type="dxa" w:w="80"/>
+              <w:left w:type="dxa" w:w="120"/>
+              <w:bottom w:type="dxa" w:w="80"/>
+              <w:right w:type="dxa" w:w="120"/>
+            </w:tcMar>
+            <w:vAlign w:val="center"/>
+          </w:tcPr>
+          <w:p>
+            <w:pPr>
+              <w:jc w:val="center"/>
+            </w:pPr>
+            <w:r>
+              <w:rPr>
+                <w:b w:val="false"/>
+                <w:bCs w:val="false"/>
+                <w:sz w:val="20"/>
+                <w:szCs w:val="20"/>
+              </w:rPr>
+              <w:t xml:space="preserve">Who wrote The Great Gatsby?</w:t>
+            </w:r>
+          </w:p>
+        </w:tc>
+      </w:tr>
+      <w:tr>
+        <w:trPr>
+          <w:cantSplit/>
+          <w:tblHeader w:val="false"/>
+        </w:trPr>
+        <w:tc>
+          <w:tcPr>
+            <w:tcW w:type="dxa" w:w="4680"/>
+            <w:tcBorders>
+              <w:top w:val="single" w:color="CCCCCC" w:sz="1"/>
+              <w:left w:val="single" w:color="CCCCCC" w:sz="1"/>
+              <w:bottom w:val="single" w:color="CCCCCC" w:sz="1"/>
+              <w:right w:val="single" w:color="CCCCCC" w:sz="1"/>
+            </w:tcBorders>
+            <w:shd w:fill="FFFFFF" w:val="clear"/>
+            <w:tcMar>
+              <w:top w:type="dxa" w:w="80"/>
+              <w:left w:type="dxa" w:w="120"/>
+              <w:bottom w:type="dxa" w:w="80"/>
+              <w:right w:type="dxa" w:w="120"/>
+            </w:tcMar>
+            <w:vAlign w:val="center"/>
+          </w:tcPr>
+          <w:p>
+            <w:pPr>
+              <w:jc w:val="left"/>
+            </w:pPr>
+            <w:r>
+              <w:rPr>
+                <w:b w:val="false"/>
+                <w:bCs w:val="false"/>
+                <w:sz w:val="20"/>
+                <w:szCs w:val="20"/>
+              </w:rPr>
+              <w:t xml:space="preserve">Prove that a stated real number is irrational.</w:t>
+            </w:r>
+          </w:p>
+        </w:tc>
+        <w:tc>
+          <w:tcPr>
+            <w:tcW w:type="dxa" w:w="4680"/>
+            <w:tcBorders>
+              <w:top w:val="single" w:color="CCCCCC" w:sz="1"/>
+              <w:left w:val="single" w:color="CCCCCC" w:sz="1"/>
+              <w:bottom w:val="single" w:color="CCCCCC" w:sz="1"/>
+              <w:right w:val="single" w:color="CCCCCC" w:sz="1"/>
+            </w:tcBorders>
+            <w:shd w:fill="FFFFFF" w:val="clear"/>
+            <w:tcMar>
+              <w:top w:type="dxa" w:w="80"/>
+              <w:left w:type="dxa" w:w="120"/>
+              <w:bottom w:type="dxa" w:w="80"/>
+              <w:right w:type="dxa" w:w="120"/>
+            </w:tcMar>
+            <w:vAlign w:val="center"/>
+          </w:tcPr>
+          <w:p>
+            <w:pPr>
+              <w:jc w:val="center"/>
+            </w:pPr>
+            <w:r>
+              <w:rPr>
+                <w:b w:val="false"/>
+                <w:bCs w:val="false"/>
+                <w:sz w:val="20"/>
+                <w:szCs w:val="20"/>
+              </w:rPr>
+              <w:t xml:space="preserve">Define photosynthesis.</w:t>
+            </w:r>
+          </w:p>
+        </w:tc>
+      </w:tr>
+    </w:tbl>
+    <w:p>
+      <w:pPr>
+        <w:spacing w:after="120"/>
+      </w:pPr>
+      <w:r>
+        <w:t xml:space="preserve"/>
+      </w:r>
+    </w:p>
+    <w:p>
+      <w:pPr>
+        <w:spacing w:after="160" w:line="276"/>
+        <w:jc w:val="both"/>
+      </w:pPr>
+      <w:r>
+        <w:t xml:space="preserve">A handful of practices separate banks that route well from banks that do not:</w:t>
+      </w:r>
+    </w:p>
+    <w:p>
+      <w:pPr>
+        <w:pStyle w:val="ListParagraph"/>
+        <w:numPr>
+          <w:ilvl w:val="0"/>
+          <w:numId w:val="3"/>
+        </w:numPr>
+        <w:spacing w:after="80"/>
       </w:pPr>
       <w:r>
         <w:rPr>
           <w:b/>
           <w:bCs/>
         </w:rPr>
-        <w:t xml:space="preserve">Make signals discriminate, not fire constantly. </w:t>
-      </w:r>
-      <w:r>
-        <w:t xml:space="preserve">An early version used four complexity signals that, on inspection, all reported the same middle value on every query. A signal that fires identically on all inputs carries no information and only adds noise to the sum. The fix was to replace them with a smaller set of signals of different kinds, one contrastive complexity signal, several embedding signals, and a few mechanical structure signals, because different signal types capture different evidence and together give the score real gradient.</w:t>
-      </w:r>
-    </w:p>
-    <w:p>
-      <w:pPr>
-        <w:spacing w:after="160" w:line="276"/>
-        <w:jc w:val="both"/>
+        <w:t xml:space="preserve">Use archetypes, not real queries. </w:t>
+      </w:r>
+      <w:r>
+        <w:t xml:space="preserve">Fill banks with generic patterns of a difficulty class, not paraphrases of the actual prompts you expect. Ten to fifteen diverse examples per bank is enough. Copying real or test queries into the banks teaches the router to recognize those specific prompts rather than the underlying shape, which looks good in testing and fails in production.</w:t>
+      </w:r>
+    </w:p>
+    <w:p>
+      <w:pPr>
+        <w:pStyle w:val="ListParagraph"/>
+        <w:numPr>
+          <w:ilvl w:val="0"/>
+          <w:numId w:val="3"/>
+        </w:numPr>
+        <w:spacing w:after="80"/>
       </w:pPr>
       <w:r>
         <w:rPr>
           <w:b/>
           <w:bCs/>
         </w:rPr>
-        <w:t xml:space="preserve">Mind the contrastive margin. </w:t>
-      </w:r>
-      <w:r>
-        <w:t xml:space="preserve">A contrastive classifier compares a prompt against the nearest example in each bank, so the banks must match the target prompts in both content and length. Short rigorous prompts, such as a one-line request to prove a number is irrational, cannot resemble long hard exemplars in embedding space, so short hard archetypes had to be added alongside the long ones. The same care applies in reverse: any math-flavored example placed in an easy bank slightly raised the easy score for genuine proofs and flipped them down a tier, so math examples were kept out of the easy and detractor banks and trivial arithmetic was anchored with a separate detractor instead.</w:t>
-      </w:r>
-    </w:p>
-    <w:p>
-      <w:pPr>
-        <w:spacing w:after="160" w:line="276"/>
-        <w:jc w:val="both"/>
+        <w:t xml:space="preserve">Cover the category broadly. </w:t>
+      </w:r>
+      <w:r>
+        <w:t xml:space="preserve">A hard bank should span the ways a prompt can be hard: multi-step reasoning, deep domain expertise, open-ended judgment, long synthesis. Narrow banks only catch the cases you happened to think of.</w:t>
+      </w:r>
+    </w:p>
+    <w:p>
+      <w:pPr>
+        <w:pStyle w:val="ListParagraph"/>
+        <w:numPr>
+          <w:ilvl w:val="0"/>
+          <w:numId w:val="3"/>
+        </w:numPr>
+        <w:spacing w:after="80"/>
       </w:pPr>
       <w:r>
         <w:rPr>
           <w:b/>
           <w:bCs/>
         </w:rPr>
-        <w:t xml:space="preserve">Tune weights and cutoffs against measured outcomes. </w:t>
-      </w:r>
-      <w:r>
-        <w:t xml:space="preserve">Thresholds that look reasonable in the abstract are often unreachable in practice. One complexity threshold was originally set so high that no query ever cleared it. The working values were found empirically by routing the benchmark, reading where queries landed, and adjusting. A single weight bump, for example raising the complexity weight so that one hard match alone clears the T3-to-T4 cutoff, can correct a whole class of misroutes.</w:t>
-      </w:r>
-    </w:p>
-    <w:p>
-      <w:pPr>
-        <w:spacing w:after="160" w:line="276"/>
-        <w:jc w:val="both"/>
+        <w:t xml:space="preserve">Match the length of your targets. </w:t>
+      </w:r>
+      <w:r>
+        <w:t xml:space="preserve">The classifier compares a prompt to its nearest neighbor in the bank, and a short prompt cannot closely resemble a long one in vector space. If some hard prompts are terse, such as a one-line request to prove a number is irrational, the hard bank needs short hard examples alongside the long ones, or those prompts will be missed.</w:t>
+      </w:r>
+    </w:p>
+    <w:p>
+      <w:pPr>
+        <w:pStyle w:val="ListParagraph"/>
+        <w:numPr>
+          <w:ilvl w:val="0"/>
+          <w:numId w:val="3"/>
+        </w:numPr>
+        <w:spacing w:after="80"/>
       </w:pPr>
       <w:r>
         <w:rPr>
           <w:b/>
           <w:bCs/>
         </w:rPr>
-        <w:t xml:space="preserve">Judge quality, not just tier match. </w:t>
-      </w:r>
-      <w:r>
-        <w:t xml:space="preserve">It is tempting to grade the router only on whether it hit a hand-labeled minimum tier. That label is a conservative floor, and grading against it alone is misleading. In this benchmark the router selected a tier at or above the hand-labeled minimum on 70 percent of queries, yet 98 percent of the cloud answers it produced were judged adequate by independent LLM judges. The gap means the smaller tiers answered many queries adequately that a cautious human had marked as needing a larger model. The honest measure of a router is whether the user would have been satisfied with the answer, which is what the adequacy judgment captures, and it is the metric to tune toward.</w:t>
-      </w:r>
-    </w:p>
-    <w:p>
-      <w:pPr>
-        <w:pStyle w:val="Heading1"/>
-      </w:pPr>
-      <w:r>
-        <w:t xml:space="preserve">7. Benchmark results from this system</w:t>
+        <w:t xml:space="preserve">Keep contaminating vocabulary out of the opposing bank. </w:t>
+      </w:r>
+      <w:r>
+        <w:t xml:space="preserve">Shared wording leaks across banks. A math-flavored example placed in an easy bank raises the easy score for genuine proofs and quietly demotes them a tier. Anchor trivial cases with a separate detractor instead of polluting the easy bank.</w:t>
+      </w:r>
+    </w:p>
+    <w:p>
+      <w:pPr>
+        <w:pStyle w:val="ListParagraph"/>
+        <w:numPr>
+          <w:ilvl w:val="0"/>
+          <w:numId w:val="3"/>
+        </w:numPr>
+        <w:spacing w:after="160"/>
+      </w:pPr>
+      <w:r>
+        <w:rPr>
+          <w:b/>
+          <w:bCs/>
+        </w:rPr>
+        <w:t xml:space="preserve">Use a detractor to anchor the floor. </w:t>
+      </w:r>
+      <w:r>
+        <w:t xml:space="preserve">A negative-weight bank of short factual and lookup prompts is the most reliable way to keep trivial questions in the cheapest tier, more reliable than hoping no positive signal fires on them.</w:t>
+      </w:r>
+    </w:p>
+    <w:p>
+      <w:pPr>
+        <w:pStyle w:val="Heading2"/>
+      </w:pPr>
+      <w:r>
+        <w:t xml:space="preserve">5.5 How the score is computed: a worked example</w:t>
       </w:r>
     </w:p>
     <w:p>
@@ -2224,15 +3714,724 @@
         <w:jc w:val="both"/>
       </w:pPr>
       <w:r>
-        <w:t xml:space="preserve">The system was exercised against a curated benchmark of 797 queries spanning all five difficulty bands, with the band populations kept roughly equal so that hard queries are deliberately over-represented relative to real traffic. Every query was routed, every routed tier produced answers from each cloud model it fronts, and every routed answer was scored by two independent LLM judges against gold reference answers from the frontier tier. The reporting below covers the cloud model results only. The rubric scored four dimensions on a one-to-four scale and assigned an overall verdict of Adequate, Marginal, or Failure.</w:t>
-      </w:r>
-    </w:p>
-    <w:p>
-      <w:pPr>
-        <w:pStyle w:val="Heading2"/>
-      </w:pPr>
-      <w:r>
-        <w:t xml:space="preserve">7.1 Where traffic went</w:t>
+        <w:t xml:space="preserve">Putting it together, here is how four prompts flow through the same configuration. The contributions shown are illustrative of the mechanism rather than exact classifier outputs, but the arithmetic is exactly what the router does: add the contributions, compare to the cutoffs, pick the band.</w:t>
+      </w:r>
+    </w:p>
+    <w:tbl>
+      <w:tblPr>
+        <w:tblW w:type="dxa" w:w="9360"/>
+        <w:tblBorders>
+          <w:top w:val="single" w:color="auto" w:sz="4"/>
+          <w:left w:val="single" w:color="auto" w:sz="4"/>
+          <w:bottom w:val="single" w:color="auto" w:sz="4"/>
+          <w:right w:val="single" w:color="auto" w:sz="4"/>
+          <w:insideH w:val="single" w:color="auto" w:sz="4"/>
+          <w:insideV w:val="single" w:color="auto" w:sz="4"/>
+        </w:tblBorders>
+      </w:tblPr>
+      <w:tblGrid>
+        <w:gridCol w:w="4060"/>
+        <w:gridCol w:w="3500"/>
+        <w:gridCol w:w="900"/>
+        <w:gridCol w:w="900"/>
+      </w:tblGrid>
+      <w:tr>
+        <w:trPr>
+          <w:cantSplit/>
+          <w:tblHeader/>
+        </w:trPr>
+        <w:tc>
+          <w:tcPr>
+            <w:tcW w:type="dxa" w:w="4060"/>
+            <w:tcBorders>
+              <w:top w:val="single" w:color="CCCCCC" w:sz="1"/>
+              <w:left w:val="single" w:color="CCCCCC" w:sz="1"/>
+              <w:bottom w:val="single" w:color="CCCCCC" w:sz="1"/>
+              <w:right w:val="single" w:color="CCCCCC" w:sz="1"/>
+            </w:tcBorders>
+            <w:shd w:fill="d5e8f0" w:val="clear"/>
+            <w:tcMar>
+              <w:top w:type="dxa" w:w="80"/>
+              <w:left w:type="dxa" w:w="120"/>
+              <w:bottom w:type="dxa" w:w="80"/>
+              <w:right w:type="dxa" w:w="120"/>
+            </w:tcMar>
+            <w:vAlign w:val="center"/>
+          </w:tcPr>
+          <w:p>
+            <w:pPr>
+              <w:jc w:val="left"/>
+            </w:pPr>
+            <w:r>
+              <w:rPr>
+                <w:b/>
+                <w:bCs/>
+                <w:sz w:val="20"/>
+                <w:szCs w:val="20"/>
+              </w:rPr>
+              <w:t xml:space="preserve">Prompt</w:t>
+            </w:r>
+          </w:p>
+        </w:tc>
+        <w:tc>
+          <w:tcPr>
+            <w:tcW w:type="dxa" w:w="3500"/>
+            <w:tcBorders>
+              <w:top w:val="single" w:color="CCCCCC" w:sz="1"/>
+              <w:left w:val="single" w:color="CCCCCC" w:sz="1"/>
+              <w:bottom w:val="single" w:color="CCCCCC" w:sz="1"/>
+              <w:right w:val="single" w:color="CCCCCC" w:sz="1"/>
+            </w:tcBorders>
+            <w:shd w:fill="d5e8f0" w:val="clear"/>
+            <w:tcMar>
+              <w:top w:type="dxa" w:w="80"/>
+              <w:left w:type="dxa" w:w="120"/>
+              <w:bottom w:type="dxa" w:w="80"/>
+              <w:right w:type="dxa" w:w="120"/>
+            </w:tcMar>
+            <w:vAlign w:val="center"/>
+          </w:tcPr>
+          <w:p>
+            <w:pPr>
+              <w:jc w:val="center"/>
+            </w:pPr>
+            <w:r>
+              <w:rPr>
+                <w:b/>
+                <w:bCs/>
+                <w:sz w:val="20"/>
+                <w:szCs w:val="20"/>
+              </w:rPr>
+              <w:t xml:space="preserve">Signals that fire (contribution)</w:t>
+            </w:r>
+          </w:p>
+        </w:tc>
+        <w:tc>
+          <w:tcPr>
+            <w:tcW w:type="dxa" w:w="900"/>
+            <w:tcBorders>
+              <w:top w:val="single" w:color="CCCCCC" w:sz="1"/>
+              <w:left w:val="single" w:color="CCCCCC" w:sz="1"/>
+              <w:bottom w:val="single" w:color="CCCCCC" w:sz="1"/>
+              <w:right w:val="single" w:color="CCCCCC" w:sz="1"/>
+            </w:tcBorders>
+            <w:shd w:fill="d5e8f0" w:val="clear"/>
+            <w:tcMar>
+              <w:top w:type="dxa" w:w="80"/>
+              <w:left w:type="dxa" w:w="120"/>
+              <w:bottom w:type="dxa" w:w="80"/>
+              <w:right w:type="dxa" w:w="120"/>
+            </w:tcMar>
+            <w:vAlign w:val="center"/>
+          </w:tcPr>
+          <w:p>
+            <w:pPr>
+              <w:jc w:val="center"/>
+            </w:pPr>
+            <w:r>
+              <w:rPr>
+                <w:b/>
+                <w:bCs/>
+                <w:sz w:val="20"/>
+                <w:szCs w:val="20"/>
+              </w:rPr>
+              <w:t xml:space="preserve">Score</w:t>
+            </w:r>
+          </w:p>
+        </w:tc>
+        <w:tc>
+          <w:tcPr>
+            <w:tcW w:type="dxa" w:w="900"/>
+            <w:tcBorders>
+              <w:top w:val="single" w:color="CCCCCC" w:sz="1"/>
+              <w:left w:val="single" w:color="CCCCCC" w:sz="1"/>
+              <w:bottom w:val="single" w:color="CCCCCC" w:sz="1"/>
+              <w:right w:val="single" w:color="CCCCCC" w:sz="1"/>
+            </w:tcBorders>
+            <w:shd w:fill="d5e8f0" w:val="clear"/>
+            <w:tcMar>
+              <w:top w:type="dxa" w:w="80"/>
+              <w:left w:type="dxa" w:w="120"/>
+              <w:bottom w:type="dxa" w:w="80"/>
+              <w:right w:type="dxa" w:w="120"/>
+            </w:tcMar>
+            <w:vAlign w:val="center"/>
+          </w:tcPr>
+          <w:p>
+            <w:pPr>
+              <w:jc w:val="center"/>
+            </w:pPr>
+            <w:r>
+              <w:rPr>
+                <w:b/>
+                <w:bCs/>
+                <w:sz w:val="20"/>
+                <w:szCs w:val="20"/>
+              </w:rPr>
+              <w:t xml:space="preserve">Tier</w:t>
+            </w:r>
+          </w:p>
+        </w:tc>
+      </w:tr>
+      <w:tr>
+        <w:trPr>
+          <w:cantSplit/>
+          <w:tblHeader w:val="false"/>
+        </w:trPr>
+        <w:tc>
+          <w:tcPr>
+            <w:tcW w:type="dxa" w:w="4060"/>
+            <w:tcBorders>
+              <w:top w:val="single" w:color="CCCCCC" w:sz="1"/>
+              <w:left w:val="single" w:color="CCCCCC" w:sz="1"/>
+              <w:bottom w:val="single" w:color="CCCCCC" w:sz="1"/>
+              <w:right w:val="single" w:color="CCCCCC" w:sz="1"/>
+            </w:tcBorders>
+            <w:shd w:fill="FFFFFF" w:val="clear"/>
+            <w:tcMar>
+              <w:top w:type="dxa" w:w="80"/>
+              <w:left w:type="dxa" w:w="120"/>
+              <w:bottom w:type="dxa" w:w="80"/>
+              <w:right w:type="dxa" w:w="120"/>
+            </w:tcMar>
+            <w:vAlign w:val="center"/>
+          </w:tcPr>
+          <w:p>
+            <w:pPr>
+              <w:jc w:val="left"/>
+            </w:pPr>
+            <w:r>
+              <w:rPr>
+                <w:b w:val="false"/>
+                <w:bCs w:val="false"/>
+                <w:sz w:val="20"/>
+                <w:szCs w:val="20"/>
+              </w:rPr>
+              <w:t xml:space="preserve">What is the capital of France?</w:t>
+            </w:r>
+          </w:p>
+        </w:tc>
+        <w:tc>
+          <w:tcPr>
+            <w:tcW w:type="dxa" w:w="3500"/>
+            <w:tcBorders>
+              <w:top w:val="single" w:color="CCCCCC" w:sz="1"/>
+              <w:left w:val="single" w:color="CCCCCC" w:sz="1"/>
+              <w:bottom w:val="single" w:color="CCCCCC" w:sz="1"/>
+              <w:right w:val="single" w:color="CCCCCC" w:sz="1"/>
+            </w:tcBorders>
+            <w:shd w:fill="FFFFFF" w:val="clear"/>
+            <w:tcMar>
+              <w:top w:type="dxa" w:w="80"/>
+              <w:left w:type="dxa" w:w="120"/>
+              <w:bottom w:type="dxa" w:w="80"/>
+              <w:right w:type="dxa" w:w="120"/>
+            </w:tcMar>
+            <w:vAlign w:val="center"/>
+          </w:tcPr>
+          <w:p>
+            <w:pPr>
+              <w:jc w:val="center"/>
+            </w:pPr>
+            <w:r>
+              <w:rPr>
+                <w:b w:val="false"/>
+                <w:bCs w:val="false"/>
+                <w:sz w:val="20"/>
+                <w:szCs w:val="20"/>
+              </w:rPr>
+              <w:t xml:space="preserve">trivial_lookup (-0.18), short_prompt (-0.05)</w:t>
+            </w:r>
+          </w:p>
+        </w:tc>
+        <w:tc>
+          <w:tcPr>
+            <w:tcW w:type="dxa" w:w="900"/>
+            <w:tcBorders>
+              <w:top w:val="single" w:color="CCCCCC" w:sz="1"/>
+              <w:left w:val="single" w:color="CCCCCC" w:sz="1"/>
+              <w:bottom w:val="single" w:color="CCCCCC" w:sz="1"/>
+              <w:right w:val="single" w:color="CCCCCC" w:sz="1"/>
+            </w:tcBorders>
+            <w:shd w:fill="FFFFFF" w:val="clear"/>
+            <w:tcMar>
+              <w:top w:type="dxa" w:w="80"/>
+              <w:left w:type="dxa" w:w="120"/>
+              <w:bottom w:type="dxa" w:w="80"/>
+              <w:right w:type="dxa" w:w="120"/>
+            </w:tcMar>
+            <w:vAlign w:val="center"/>
+          </w:tcPr>
+          <w:p>
+            <w:pPr>
+              <w:jc w:val="center"/>
+            </w:pPr>
+            <w:r>
+              <w:rPr>
+                <w:b w:val="false"/>
+                <w:bCs w:val="false"/>
+                <w:sz w:val="20"/>
+                <w:szCs w:val="20"/>
+              </w:rPr>
+              <w:t xml:space="preserve">-0.23</w:t>
+            </w:r>
+          </w:p>
+        </w:tc>
+        <w:tc>
+          <w:tcPr>
+            <w:tcW w:type="dxa" w:w="900"/>
+            <w:tcBorders>
+              <w:top w:val="single" w:color="CCCCCC" w:sz="1"/>
+              <w:left w:val="single" w:color="CCCCCC" w:sz="1"/>
+              <w:bottom w:val="single" w:color="CCCCCC" w:sz="1"/>
+              <w:right w:val="single" w:color="CCCCCC" w:sz="1"/>
+            </w:tcBorders>
+            <w:shd w:fill="FFFFFF" w:val="clear"/>
+            <w:tcMar>
+              <w:top w:type="dxa" w:w="80"/>
+              <w:left w:type="dxa" w:w="120"/>
+              <w:bottom w:type="dxa" w:w="80"/>
+              <w:right w:type="dxa" w:w="120"/>
+            </w:tcMar>
+            <w:vAlign w:val="center"/>
+          </w:tcPr>
+          <w:p>
+            <w:pPr>
+              <w:jc w:val="center"/>
+            </w:pPr>
+            <w:r>
+              <w:rPr>
+                <w:b w:val="false"/>
+                <w:bCs w:val="false"/>
+                <w:sz w:val="20"/>
+                <w:szCs w:val="20"/>
+              </w:rPr>
+              <w:t xml:space="preserve">T1</w:t>
+            </w:r>
+          </w:p>
+        </w:tc>
+      </w:tr>
+      <w:tr>
+        <w:trPr>
+          <w:cantSplit/>
+          <w:tblHeader w:val="false"/>
+        </w:trPr>
+        <w:tc>
+          <w:tcPr>
+            <w:tcW w:type="dxa" w:w="4060"/>
+            <w:tcBorders>
+              <w:top w:val="single" w:color="CCCCCC" w:sz="1"/>
+              <w:left w:val="single" w:color="CCCCCC" w:sz="1"/>
+              <w:bottom w:val="single" w:color="CCCCCC" w:sz="1"/>
+              <w:right w:val="single" w:color="CCCCCC" w:sz="1"/>
+            </w:tcBorders>
+            <w:shd w:fill="FFFFFF" w:val="clear"/>
+            <w:tcMar>
+              <w:top w:type="dxa" w:w="80"/>
+              <w:left w:type="dxa" w:w="120"/>
+              <w:bottom w:type="dxa" w:w="80"/>
+              <w:right w:type="dxa" w:w="120"/>
+            </w:tcMar>
+            <w:vAlign w:val="center"/>
+          </w:tcPr>
+          <w:p>
+            <w:pPr>
+              <w:jc w:val="left"/>
+            </w:pPr>
+            <w:r>
+              <w:rPr>
+                <w:b w:val="false"/>
+                <w:bCs w:val="false"/>
+                <w:sz w:val="20"/>
+                <w:szCs w:val="20"/>
+              </w:rPr>
+              <w:t xml:space="preserve">Compare TCP, UDP, and SCTP and the trade-offs of each.</w:t>
+            </w:r>
+          </w:p>
+        </w:tc>
+        <w:tc>
+          <w:tcPr>
+            <w:tcW w:type="dxa" w:w="3500"/>
+            <w:tcBorders>
+              <w:top w:val="single" w:color="CCCCCC" w:sz="1"/>
+              <w:left w:val="single" w:color="CCCCCC" w:sz="1"/>
+              <w:bottom w:val="single" w:color="CCCCCC" w:sz="1"/>
+              <w:right w:val="single" w:color="CCCCCC" w:sz="1"/>
+            </w:tcBorders>
+            <w:shd w:fill="FFFFFF" w:val="clear"/>
+            <w:tcMar>
+              <w:top w:type="dxa" w:w="80"/>
+              <w:left w:type="dxa" w:w="120"/>
+              <w:bottom w:type="dxa" w:w="80"/>
+              <w:right w:type="dxa" w:w="120"/>
+            </w:tcMar>
+            <w:vAlign w:val="center"/>
+          </w:tcPr>
+          <w:p>
+            <w:pPr>
+              <w:jc w:val="center"/>
+            </w:pPr>
+            <w:r>
+              <w:rPr>
+                <w:b w:val="false"/>
+                <w:bCs w:val="false"/>
+                <w:sz w:val="20"/>
+                <w:szCs w:val="20"/>
+              </w:rPr>
+              <w:t xml:space="preserve">moderate_complexity (+0.14)</w:t>
+            </w:r>
+          </w:p>
+        </w:tc>
+        <w:tc>
+          <w:tcPr>
+            <w:tcW w:type="dxa" w:w="900"/>
+            <w:tcBorders>
+              <w:top w:val="single" w:color="CCCCCC" w:sz="1"/>
+              <w:left w:val="single" w:color="CCCCCC" w:sz="1"/>
+              <w:bottom w:val="single" w:color="CCCCCC" w:sz="1"/>
+              <w:right w:val="single" w:color="CCCCCC" w:sz="1"/>
+            </w:tcBorders>
+            <w:shd w:fill="FFFFFF" w:val="clear"/>
+            <w:tcMar>
+              <w:top w:type="dxa" w:w="80"/>
+              <w:left w:type="dxa" w:w="120"/>
+              <w:bottom w:type="dxa" w:w="80"/>
+              <w:right w:type="dxa" w:w="120"/>
+            </w:tcMar>
+            <w:vAlign w:val="center"/>
+          </w:tcPr>
+          <w:p>
+            <w:pPr>
+              <w:jc w:val="center"/>
+            </w:pPr>
+            <w:r>
+              <w:rPr>
+                <w:b w:val="false"/>
+                <w:bCs w:val="false"/>
+                <w:sz w:val="20"/>
+                <w:szCs w:val="20"/>
+              </w:rPr>
+              <w:t xml:space="preserve">0.14</w:t>
+            </w:r>
+          </w:p>
+        </w:tc>
+        <w:tc>
+          <w:tcPr>
+            <w:tcW w:type="dxa" w:w="900"/>
+            <w:tcBorders>
+              <w:top w:val="single" w:color="CCCCCC" w:sz="1"/>
+              <w:left w:val="single" w:color="CCCCCC" w:sz="1"/>
+              <w:bottom w:val="single" w:color="CCCCCC" w:sz="1"/>
+              <w:right w:val="single" w:color="CCCCCC" w:sz="1"/>
+            </w:tcBorders>
+            <w:shd w:fill="FFFFFF" w:val="clear"/>
+            <w:tcMar>
+              <w:top w:type="dxa" w:w="80"/>
+              <w:left w:type="dxa" w:w="120"/>
+              <w:bottom w:type="dxa" w:w="80"/>
+              <w:right w:type="dxa" w:w="120"/>
+            </w:tcMar>
+            <w:vAlign w:val="center"/>
+          </w:tcPr>
+          <w:p>
+            <w:pPr>
+              <w:jc w:val="center"/>
+            </w:pPr>
+            <w:r>
+              <w:rPr>
+                <w:b w:val="false"/>
+                <w:bCs w:val="false"/>
+                <w:sz w:val="20"/>
+                <w:szCs w:val="20"/>
+              </w:rPr>
+              <w:t xml:space="preserve">T3</w:t>
+            </w:r>
+          </w:p>
+        </w:tc>
+      </w:tr>
+      <w:tr>
+        <w:trPr>
+          <w:cantSplit/>
+          <w:tblHeader w:val="false"/>
+        </w:trPr>
+        <w:tc>
+          <w:tcPr>
+            <w:tcW w:type="dxa" w:w="4060"/>
+            <w:tcBorders>
+              <w:top w:val="single" w:color="CCCCCC" w:sz="1"/>
+              <w:left w:val="single" w:color="CCCCCC" w:sz="1"/>
+              <w:bottom w:val="single" w:color="CCCCCC" w:sz="1"/>
+              <w:right w:val="single" w:color="CCCCCC" w:sz="1"/>
+            </w:tcBorders>
+            <w:shd w:fill="FFFFFF" w:val="clear"/>
+            <w:tcMar>
+              <w:top w:type="dxa" w:w="80"/>
+              <w:left w:type="dxa" w:w="120"/>
+              <w:bottom w:type="dxa" w:w="80"/>
+              <w:right w:type="dxa" w:w="120"/>
+            </w:tcMar>
+            <w:vAlign w:val="center"/>
+          </w:tcPr>
+          <w:p>
+            <w:pPr>
+              <w:jc w:val="left"/>
+            </w:pPr>
+            <w:r>
+              <w:rPr>
+                <w:b w:val="false"/>
+                <w:bCs w:val="false"/>
+                <w:sz w:val="20"/>
+                <w:szCs w:val="20"/>
+              </w:rPr>
+              <w:t xml:space="preserve">Should we adopt this framework across the org? Take a position and defend it.</w:t>
+            </w:r>
+          </w:p>
+        </w:tc>
+        <w:tc>
+          <w:tcPr>
+            <w:tcW w:type="dxa" w:w="3500"/>
+            <w:tcBorders>
+              <w:top w:val="single" w:color="CCCCCC" w:sz="1"/>
+              <w:left w:val="single" w:color="CCCCCC" w:sz="1"/>
+              <w:bottom w:val="single" w:color="CCCCCC" w:sz="1"/>
+              <w:right w:val="single" w:color="CCCCCC" w:sz="1"/>
+            </w:tcBorders>
+            <w:shd w:fill="FFFFFF" w:val="clear"/>
+            <w:tcMar>
+              <w:top w:type="dxa" w:w="80"/>
+              <w:left w:type="dxa" w:w="120"/>
+              <w:bottom w:type="dxa" w:w="80"/>
+              <w:right w:type="dxa" w:w="120"/>
+            </w:tcMar>
+            <w:vAlign w:val="center"/>
+          </w:tcPr>
+          <w:p>
+            <w:pPr>
+              <w:jc w:val="center"/>
+            </w:pPr>
+            <w:r>
+              <w:rPr>
+                <w:b w:val="false"/>
+                <w:bCs w:val="false"/>
+                <w:sz w:val="20"/>
+                <w:szCs w:val="20"/>
+              </w:rPr>
+              <w:t xml:space="preserve">argumentative_construction (+0.18)</w:t>
+            </w:r>
+          </w:p>
+        </w:tc>
+        <w:tc>
+          <w:tcPr>
+            <w:tcW w:type="dxa" w:w="900"/>
+            <w:tcBorders>
+              <w:top w:val="single" w:color="CCCCCC" w:sz="1"/>
+              <w:left w:val="single" w:color="CCCCCC" w:sz="1"/>
+              <w:bottom w:val="single" w:color="CCCCCC" w:sz="1"/>
+              <w:right w:val="single" w:color="CCCCCC" w:sz="1"/>
+            </w:tcBorders>
+            <w:shd w:fill="FFFFFF" w:val="clear"/>
+            <w:tcMar>
+              <w:top w:type="dxa" w:w="80"/>
+              <w:left w:type="dxa" w:w="120"/>
+              <w:bottom w:type="dxa" w:w="80"/>
+              <w:right w:type="dxa" w:w="120"/>
+            </w:tcMar>
+            <w:vAlign w:val="center"/>
+          </w:tcPr>
+          <w:p>
+            <w:pPr>
+              <w:jc w:val="center"/>
+            </w:pPr>
+            <w:r>
+              <w:rPr>
+                <w:b w:val="false"/>
+                <w:bCs w:val="false"/>
+                <w:sz w:val="20"/>
+                <w:szCs w:val="20"/>
+              </w:rPr>
+              <w:t xml:space="preserve">0.18</w:t>
+            </w:r>
+          </w:p>
+        </w:tc>
+        <w:tc>
+          <w:tcPr>
+            <w:tcW w:type="dxa" w:w="900"/>
+            <w:tcBorders>
+              <w:top w:val="single" w:color="CCCCCC" w:sz="1"/>
+              <w:left w:val="single" w:color="CCCCCC" w:sz="1"/>
+              <w:bottom w:val="single" w:color="CCCCCC" w:sz="1"/>
+              <w:right w:val="single" w:color="CCCCCC" w:sz="1"/>
+            </w:tcBorders>
+            <w:shd w:fill="FFFFFF" w:val="clear"/>
+            <w:tcMar>
+              <w:top w:type="dxa" w:w="80"/>
+              <w:left w:type="dxa" w:w="120"/>
+              <w:bottom w:type="dxa" w:w="80"/>
+              <w:right w:type="dxa" w:w="120"/>
+            </w:tcMar>
+            <w:vAlign w:val="center"/>
+          </w:tcPr>
+          <w:p>
+            <w:pPr>
+              <w:jc w:val="center"/>
+            </w:pPr>
+            <w:r>
+              <w:rPr>
+                <w:b w:val="false"/>
+                <w:bCs w:val="false"/>
+                <w:sz w:val="20"/>
+                <w:szCs w:val="20"/>
+              </w:rPr>
+              <w:t xml:space="preserve">T4</w:t>
+            </w:r>
+          </w:p>
+        </w:tc>
+      </w:tr>
+      <w:tr>
+        <w:trPr>
+          <w:cantSplit/>
+          <w:tblHeader w:val="false"/>
+        </w:trPr>
+        <w:tc>
+          <w:tcPr>
+            <w:tcW w:type="dxa" w:w="4060"/>
+            <w:tcBorders>
+              <w:top w:val="single" w:color="CCCCCC" w:sz="1"/>
+              <w:left w:val="single" w:color="CCCCCC" w:sz="1"/>
+              <w:bottom w:val="single" w:color="CCCCCC" w:sz="1"/>
+              <w:right w:val="single" w:color="CCCCCC" w:sz="1"/>
+            </w:tcBorders>
+            <w:shd w:fill="FFFFFF" w:val="clear"/>
+            <w:tcMar>
+              <w:top w:type="dxa" w:w="80"/>
+              <w:left w:type="dxa" w:w="120"/>
+              <w:bottom w:type="dxa" w:w="80"/>
+              <w:right w:type="dxa" w:w="120"/>
+            </w:tcMar>
+            <w:vAlign w:val="center"/>
+          </w:tcPr>
+          <w:p>
+            <w:pPr>
+              <w:jc w:val="left"/>
+            </w:pPr>
+            <w:r>
+              <w:rPr>
+                <w:b w:val="false"/>
+                <w:bCs w:val="false"/>
+                <w:sz w:val="20"/>
+                <w:szCs w:val="20"/>
+              </w:rPr>
+              <w:t xml:space="preserve">Construct an original argument for a non-obvious philosophical position and defend it without retreat.</w:t>
+            </w:r>
+          </w:p>
+        </w:tc>
+        <w:tc>
+          <w:tcPr>
+            <w:tcW w:type="dxa" w:w="3500"/>
+            <w:tcBorders>
+              <w:top w:val="single" w:color="CCCCCC" w:sz="1"/>
+              <w:left w:val="single" w:color="CCCCCC" w:sz="1"/>
+              <w:bottom w:val="single" w:color="CCCCCC" w:sz="1"/>
+              <w:right w:val="single" w:color="CCCCCC" w:sz="1"/>
+            </w:tcBorders>
+            <w:shd w:fill="FFFFFF" w:val="clear"/>
+            <w:tcMar>
+              <w:top w:type="dxa" w:w="80"/>
+              <w:left w:type="dxa" w:w="120"/>
+              <w:bottom w:type="dxa" w:w="80"/>
+              <w:right w:type="dxa" w:w="120"/>
+            </w:tcMar>
+            <w:vAlign w:val="center"/>
+          </w:tcPr>
+          <w:p>
+            <w:pPr>
+              <w:jc w:val="center"/>
+            </w:pPr>
+            <w:r>
+              <w:rPr>
+                <w:b w:val="false"/>
+                <w:bCs w:val="false"/>
+                <w:sz w:val="20"/>
+                <w:szCs w:val="20"/>
+              </w:rPr>
+              <w:t xml:space="preserve">query_difficulty hard (+0.24), frontier_synthesis (+0.15), long_prompt (+0.08)</w:t>
+            </w:r>
+          </w:p>
+        </w:tc>
+        <w:tc>
+          <w:tcPr>
+            <w:tcW w:type="dxa" w:w="900"/>
+            <w:tcBorders>
+              <w:top w:val="single" w:color="CCCCCC" w:sz="1"/>
+              <w:left w:val="single" w:color="CCCCCC" w:sz="1"/>
+              <w:bottom w:val="single" w:color="CCCCCC" w:sz="1"/>
+              <w:right w:val="single" w:color="CCCCCC" w:sz="1"/>
+            </w:tcBorders>
+            <w:shd w:fill="FFFFFF" w:val="clear"/>
+            <w:tcMar>
+              <w:top w:type="dxa" w:w="80"/>
+              <w:left w:type="dxa" w:w="120"/>
+              <w:bottom w:type="dxa" w:w="80"/>
+              <w:right w:type="dxa" w:w="120"/>
+            </w:tcMar>
+            <w:vAlign w:val="center"/>
+          </w:tcPr>
+          <w:p>
+            <w:pPr>
+              <w:jc w:val="center"/>
+            </w:pPr>
+            <w:r>
+              <w:rPr>
+                <w:b w:val="false"/>
+                <w:bCs w:val="false"/>
+                <w:sz w:val="20"/>
+                <w:szCs w:val="20"/>
+              </w:rPr>
+              <w:t xml:space="preserve">0.47</w:t>
+            </w:r>
+          </w:p>
+        </w:tc>
+        <w:tc>
+          <w:tcPr>
+            <w:tcW w:type="dxa" w:w="900"/>
+            <w:tcBorders>
+              <w:top w:val="single" w:color="CCCCCC" w:sz="1"/>
+              <w:left w:val="single" w:color="CCCCCC" w:sz="1"/>
+              <w:bottom w:val="single" w:color="CCCCCC" w:sz="1"/>
+              <w:right w:val="single" w:color="CCCCCC" w:sz="1"/>
+            </w:tcBorders>
+            <w:shd w:fill="FFFFFF" w:val="clear"/>
+            <w:tcMar>
+              <w:top w:type="dxa" w:w="80"/>
+              <w:left w:type="dxa" w:w="120"/>
+              <w:bottom w:type="dxa" w:w="80"/>
+              <w:right w:type="dxa" w:w="120"/>
+            </w:tcMar>
+            <w:vAlign w:val="center"/>
+          </w:tcPr>
+          <w:p>
+            <w:pPr>
+              <w:jc w:val="center"/>
+            </w:pPr>
+            <w:r>
+              <w:rPr>
+                <w:b w:val="false"/>
+                <w:bCs w:val="false"/>
+                <w:sz w:val="20"/>
+                <w:szCs w:val="20"/>
+              </w:rPr>
+              <w:t xml:space="preserve">T5</w:t>
+            </w:r>
+          </w:p>
+        </w:tc>
+      </w:tr>
+    </w:tbl>
+    <w:p>
+      <w:pPr>
+        <w:spacing w:after="120"/>
+      </w:pPr>
+      <w:r>
+        <w:t xml:space="preserve"/>
       </w:r>
     </w:p>
     <w:p>
@@ -2241,7 +4440,24 @@
         <w:jc w:val="both"/>
       </w:pPr>
       <w:r>
-        <w:t xml:space="preserve">The router distributed the 797 queries across all five tiers. Because the benchmark over-weights hard queries, the upper tiers carry more traffic here than they would in production, where the easy tiers would dominate.</w:t>
+        <w:t xml:space="preserve">There is no hidden step. The score is the sum of the contributions, and the cutoffs decide the tier. Everything that determines a routing decision is visible in one configuration file, which is what makes the behavior debuggable and tunable rather than opaque.</w:t>
+      </w:r>
+    </w:p>
+    <w:p>
+      <w:pPr>
+        <w:pStyle w:val="Heading2"/>
+      </w:pPr>
+      <w:r>
+        <w:t xml:space="preserve">5.6 Setting the cutoffs and the bands</w:t>
+      </w:r>
+    </w:p>
+    <w:p>
+      <w:pPr>
+        <w:spacing w:after="160" w:line="276"/>
+        <w:jc w:val="both"/>
+      </w:pPr>
+      <w:r>
+        <w:t xml:space="preserve">The cutoffs are the last piece. Four of them split the difficulty score into five bands, one per tier. In this configuration the cutoffs are 0.03, 0.10, 0.18, and 0.40, against a practical score range of roughly minus 0.15 to 0.70. A trivial question that strongly matches the detractor lands below the first cutoff and routes to T1. A question that fires the complexity and frontier signals together clears the top cutoff and routes to T5. The cutoffs are a blunt instrument: moving one shifts every query near it, so they are tuned last, after the signals and weights are doing their job.</w:t>
       </w:r>
     </w:p>
     <w:p>
@@ -2252,9 +4468,9 @@
       <w:r>
         <w:drawing>
           <wp:inline distT="0" distB="0" distL="0" distR="0">
-            <wp:extent cx="5715000" cy="2800350"/>
+            <wp:extent cx="5715000" cy="1809750"/>
             <wp:effectExtent t="0" r="0" b="0" l="0"/>
-            <wp:docPr id="1" name="fig_distribution.png" descr="Figure 5. Routing distribution across the 797-query benchmark. The flat-by-difficulty benchmark sends more traffic to the upper tiers than production traffic would." title="Figure 5. Routing distribution across the 797-query benchmark. The flat-by-difficulty benchmark sends more traffic to the upper tiers than production traffic would."/>
+            <wp:docPr id="1" name="fig_banding.png" descr="Figure 5. The same scoring model on a number line. Every signal feeds one weighted sum, and the four cutoffs partition that sum into the five tier bands." title="Figure 5. The same scoring model on a number line. Every signal feeds one weighted sum, and the four cutoffs partition that sum into the five tier bands."/>
             <wp:cNvGraphicFramePr>
               <a:graphicFrameLocks xmlns:a="http://schemas.openxmlformats.org/drawingml/2006/main" noChangeAspect="1"/>
             </wp:cNvGraphicFramePr>
@@ -2277,7 +4493,7 @@
                   <pic:spPr bwMode="auto">
                     <a:xfrm>
                       <a:off x="0" y="0"/>
-                      <a:ext cx="5715000" cy="2800350"/>
+                      <a:ext cx="5715000" cy="1809750"/>
                     </a:xfrm>
                     <a:prstGeom prst="rect">
                       <a:avLst/>
@@ -2303,15 +4519,15 @@
           <w:sz w:val="18"/>
           <w:szCs w:val="18"/>
         </w:rPr>
-        <w:t xml:space="preserve">Figure 5. Routing distribution across the 797-query benchmark. The flat-by-difficulty benchmark sends more traffic to the upper tiers than production traffic would.</w:t>
-      </w:r>
-    </w:p>
-    <w:p>
-      <w:pPr>
-        <w:pStyle w:val="Heading2"/>
-      </w:pPr>
-      <w:r>
-        <w:t xml:space="preserve">7.2 Whether the answers were good enough</w:t>
+        <w:t xml:space="preserve">Figure 5. The same scoring model on a number line. Every signal feeds one weighted sum, and the four cutoffs partition that sum into the five tier bands.</w:t>
+      </w:r>
+    </w:p>
+    <w:p>
+      <w:pPr>
+        <w:pStyle w:val="Heading1"/>
+      </w:pPr>
+      <w:r>
+        <w:t xml:space="preserve">6. Tuning: an iterative process</w:t>
       </w:r>
     </w:p>
     <w:p>
@@ -2320,17 +4536,7 @@
         <w:jc w:val="both"/>
       </w:pPr>
       <w:r>
-        <w:t xml:space="preserve">Across 6,268 answer-by-judge comparisons of routed cloud answers, </w:t>
-      </w:r>
-      <w:r>
-        <w:rPr>
-          <w:b/>
-          <w:bCs/>
-        </w:rPr>
-        <w:t xml:space="preserve">98 percent were judged Adequate</w:t>
-      </w:r>
-      <w:r>
-        <w:t xml:space="preserve">, under 2 percent Marginal, and under 1 percent Failure. Per-tier adequacy held between 96 and 100 percent, so the small tiers were not trading quality for cost: the cheapest T1 cloud models were judged adequate on essentially every query routed to them. Averaged across all routed answers, the judges scored correctness at 3.98 out of 4, completeness at 3.97, supporting-fact soundness at 3.98, and fitness for purpose at 3.58.</w:t>
+        <w:t xml:space="preserve">A first configuration is an educated guess. Tuning is the loop that turns it into a reliable router, and it is empirical rather than analytical: you route a set of known queries, see where they land, fix the largest error, and repeat. The three surfaces you adjust all live in the one configuration file, namely the exemplar banks, the per-signal weights, and the band cutoffs. The goal of each pass is to move misrouted queries into the right band without dragging correctly-routed queries out of theirs.</w:t>
       </w:r>
     </w:p>
     <w:p>
@@ -2341,9 +4547,9 @@
       <w:r>
         <w:drawing>
           <wp:inline distT="0" distB="0" distL="0" distR="0">
-            <wp:extent cx="5715000" cy="2800350"/>
+            <wp:extent cx="4095750" cy="5229225"/>
             <wp:effectExtent t="0" r="0" b="0" l="0"/>
-            <wp:docPr id="1" name="fig_adequacy.png" descr="Figure 6. Answer quality at the tier the router selected, cloud models only. Adequacy stays between 96 and 100 percent across tiers, so right-sizing does not cost quality." title="Figure 6. Answer quality at the tier the router selected, cloud models only. Adequacy stays between 96 and 100 percent across tiers, so right-sizing does not cost quality."/>
+            <wp:docPr id="1" name="fig_tuning_flow.png" descr="Figure 6. The tuning loop. Route a labeled set, measure where queries land, fix the largest error with the cheapest available lever, and re-measure. Stop when the misroutes that remain are acceptable." title="Figure 6. The tuning loop. Route a labeled set, measure where queries land, fix the largest error with the cheapest available lever, and re-measure. Stop when the misroutes that remain are acceptable."/>
             <wp:cNvGraphicFramePr>
               <a:graphicFrameLocks xmlns:a="http://schemas.openxmlformats.org/drawingml/2006/main" noChangeAspect="1"/>
             </wp:cNvGraphicFramePr>
@@ -2366,6 +4572,280 @@
                   <pic:spPr bwMode="auto">
                     <a:xfrm>
                       <a:off x="0" y="0"/>
+                      <a:ext cx="4095750" cy="5229225"/>
+                    </a:xfrm>
+                    <a:prstGeom prst="rect">
+                      <a:avLst/>
+                    </a:prstGeom>
+                  </pic:spPr>
+                </pic:pic>
+              </a:graphicData>
+            </a:graphic>
+          </wp:inline>
+        </w:drawing>
+      </w:r>
+    </w:p>
+    <w:p>
+      <w:pPr>
+        <w:spacing w:after="200"/>
+        <w:jc w:val="center"/>
+      </w:pPr>
+      <w:r>
+        <w:rPr>
+          <w:i/>
+          <w:iCs/>
+          <w:color w:val="46566b"/>
+          <w:sz w:val="18"/>
+          <w:szCs w:val="18"/>
+        </w:rPr>
+        <w:t xml:space="preserve">Figure 6. The tuning loop. Route a labeled set, measure where queries land, fix the largest error with the cheapest available lever, and re-measure. Stop when the misroutes that remain are acceptable.</w:t>
+      </w:r>
+    </w:p>
+    <w:p>
+      <w:pPr>
+        <w:spacing w:after="160" w:line="276"/>
+        <w:jc w:val="both"/>
+      </w:pPr>
+      <w:r>
+        <w:t xml:space="preserve">The loop has five steps.</w:t>
+      </w:r>
+    </w:p>
+    <w:p>
+      <w:pPr>
+        <w:spacing w:after="160" w:line="276"/>
+        <w:jc w:val="both"/>
+      </w:pPr>
+      <w:r>
+        <w:rPr>
+          <w:b/>
+          <w:bCs/>
+        </w:rPr>
+        <w:t xml:space="preserve">Step 1. Assemble a labeled dev set. </w:t>
+      </w:r>
+      <w:r>
+        <w:t xml:space="preserve">Collect a few dozen to a few hundred queries that span the full difficulty range, and tag each with the lowest tier you believe should answer it well. This is your answer key. Keep it separate from the exemplar banks, so you are never grading the router on the very examples you trained it with.</w:t>
+      </w:r>
+    </w:p>
+    <w:p>
+      <w:pPr>
+        <w:spacing w:after="160" w:line="276"/>
+        <w:jc w:val="both"/>
+      </w:pPr>
+      <w:r>
+        <w:rPr>
+          <w:b/>
+          <w:bCs/>
+        </w:rPr>
+        <w:t xml:space="preserve">Step 2. Build the config and route the dev set. </w:t>
+      </w:r>
+      <w:r>
+        <w:t xml:space="preserve">Compile the configuration and send every dev query through the router, which records the tier each one lands in. Because a routing decision does not require a real model answer, this pass is fast and inexpensive and can run against a local mock rather than paid endpoints.</w:t>
+      </w:r>
+    </w:p>
+    <w:p>
+      <w:pPr>
+        <w:spacing w:after="160" w:line="276"/>
+        <w:jc w:val="both"/>
+      </w:pPr>
+      <w:r>
+        <w:rPr>
+          <w:b/>
+          <w:bCs/>
+        </w:rPr>
+        <w:t xml:space="preserve">Step 3. Measure outcomes. </w:t>
+      </w:r>
+      <w:r>
+        <w:t xml:space="preserve">Compare where each query landed against its label, and look at the distribution across tiers. Two error types matter: an under-route, where the score came out too low and a hard query went to a small tier, and an over-route, where the score came out too high and an easy query went to an expensive one. Where you can, also judge answer adequacy, because a query that lands one tier below its label but is still answered adequately is not actually a failure.</w:t>
+      </w:r>
+    </w:p>
+    <w:p>
+      <w:pPr>
+        <w:spacing w:after="160" w:line="276"/>
+        <w:jc w:val="both"/>
+      </w:pPr>
+      <w:r>
+        <w:rPr>
+          <w:b/>
+          <w:bCs/>
+        </w:rPr>
+        <w:t xml:space="preserve">Step 4. Diagnose each misroute. </w:t>
+      </w:r>
+      <w:r>
+        <w:t xml:space="preserve">For each cluster of errors, find the signal at fault. An under-route usually means a signal that should have fired did not: the prompt resembled nothing in the relevant bank, or the threshold was set too high to clear. An over-route usually means a signal fired when it should not have: a bank was too broad, or a detractor that should have anchored the prompt was missing.</w:t>
+      </w:r>
+    </w:p>
+    <w:p>
+      <w:pPr>
+        <w:spacing w:after="160" w:line="276"/>
+        <w:jc w:val="both"/>
+      </w:pPr>
+      <w:r>
+        <w:rPr>
+          <w:b/>
+          <w:bCs/>
+        </w:rPr>
+        <w:t xml:space="preserve">Step 5. Apply the smallest fix, then return to Step 2. </w:t>
+      </w:r>
+      <w:r>
+        <w:t xml:space="preserve">Reach for the most local lever first. Add or sharpen exemplars before changing weights, and change weights before moving cutoffs. The reason is blast radius: an exemplar edit affects only prompts near it, a weight change affects every query that fires that signal, and a cutoff change moves every query at once. Make one change, recompile, and re-route. Resist changing several things between measurements, or you will not know which one helped.</w:t>
+      </w:r>
+    </w:p>
+    <w:p>
+      <w:pPr>
+        <w:spacing w:after="160" w:line="276"/>
+        <w:jc w:val="both"/>
+      </w:pPr>
+      <w:r>
+        <w:t xml:space="preserve">Several recurring fixes came out of building this router and are worth keeping as a checklist.</w:t>
+      </w:r>
+    </w:p>
+    <w:p>
+      <w:pPr>
+        <w:spacing w:after="160" w:line="276"/>
+        <w:jc w:val="both"/>
+      </w:pPr>
+      <w:r>
+        <w:rPr>
+          <w:b/>
+          <w:bCs/>
+        </w:rPr>
+        <w:t xml:space="preserve">Make signals discriminate, not fire constantly. </w:t>
+      </w:r>
+      <w:r>
+        <w:t xml:space="preserve">An early version used four complexity signals that, on inspection, all reported the same middle value on every query. A signal that fires identically on all inputs carries no information and only adds noise to the sum. The fix was to replace them with a smaller set of signals of different kinds, one contrastive complexity signal, several embedding signals, and a few mechanical structure signals, because different signal types capture different evidence and together give the score real gradient.</w:t>
+      </w:r>
+    </w:p>
+    <w:p>
+      <w:pPr>
+        <w:spacing w:after="160" w:line="276"/>
+        <w:jc w:val="both"/>
+      </w:pPr>
+      <w:r>
+        <w:rPr>
+          <w:b/>
+          <w:bCs/>
+        </w:rPr>
+        <w:t xml:space="preserve">Mind the contrastive margin. </w:t>
+      </w:r>
+      <w:r>
+        <w:t xml:space="preserve">A contrastive classifier compares a prompt against the nearest example in each bank, so the banks must match the target prompts in both content and length. Short rigorous prompts, such as a one-line request to prove a number is irrational, cannot resemble long hard exemplars in embedding space, so short hard archetypes had to be added alongside the long ones. The same care applies in reverse: any math-flavored example placed in an easy bank slightly raised the easy score for genuine proofs and flipped them down a tier, so math examples were kept out of the easy and detractor banks and trivial arithmetic was anchored with a separate detractor instead.</w:t>
+      </w:r>
+    </w:p>
+    <w:p>
+      <w:pPr>
+        <w:spacing w:after="160" w:line="276"/>
+        <w:jc w:val="both"/>
+      </w:pPr>
+      <w:r>
+        <w:rPr>
+          <w:b/>
+          <w:bCs/>
+        </w:rPr>
+        <w:t xml:space="preserve">Tune weights and cutoffs against measured outcomes. </w:t>
+      </w:r>
+      <w:r>
+        <w:t xml:space="preserve">Thresholds that look reasonable in the abstract are often unreachable in practice. One complexity threshold was originally set so high that no query ever cleared it. The working values were found empirically by routing the benchmark, reading where queries landed, and adjusting. A single weight bump, for example raising the complexity weight so that one hard match alone clears the T3-to-T4 cutoff, can correct a whole class of misroutes.</w:t>
+      </w:r>
+    </w:p>
+    <w:p>
+      <w:pPr>
+        <w:spacing w:after="160" w:line="276"/>
+        <w:jc w:val="both"/>
+      </w:pPr>
+      <w:r>
+        <w:rPr>
+          <w:b/>
+          <w:bCs/>
+        </w:rPr>
+        <w:t xml:space="preserve">Judge quality, not just tier match. </w:t>
+      </w:r>
+      <w:r>
+        <w:t xml:space="preserve">It is tempting to grade the router only on whether it hit a hand-labeled minimum tier. That label is a conservative floor, and grading against it alone is misleading. In this benchmark the router selected a tier at or above the hand-labeled minimum on 70 percent of queries, yet 98 percent of the cloud answers it produced were judged adequate by independent LLM judges. The gap means the smaller tiers answered many queries adequately that a cautious human had marked as needing a larger model. The honest measure of a router is whether the user would have been satisfied with the answer, which is what the adequacy judgment captures, and it is the metric to tune toward.</w:t>
+      </w:r>
+    </w:p>
+    <w:p>
+      <w:pPr>
+        <w:spacing w:after="160" w:line="276"/>
+        <w:jc w:val="both"/>
+      </w:pPr>
+      <w:r>
+        <w:rPr>
+          <w:b/>
+          <w:bCs/>
+        </w:rPr>
+        <w:t xml:space="preserve">Know when to stop. </w:t>
+      </w:r>
+      <w:r>
+        <w:t xml:space="preserve">Tuning has a natural end. When fixes for one query start breaking others, the configuration is near its useful limit and further changes trade one error for another. Two habits protect against over-fitting to the dev set. Keep exemplars generic rather than tailored to specific prompts, and validate the final configuration on a held-out set of queries that you never tuned against. A router that performs well on prompts it has never seen is the only kind worth shipping.</w:t>
+      </w:r>
+    </w:p>
+    <w:p>
+      <w:pPr>
+        <w:pStyle w:val="Heading1"/>
+      </w:pPr>
+      <w:r>
+        <w:t xml:space="preserve">7. Benchmark results from this system</w:t>
+      </w:r>
+    </w:p>
+    <w:p>
+      <w:pPr>
+        <w:spacing w:after="160" w:line="276"/>
+        <w:jc w:val="both"/>
+      </w:pPr>
+      <w:r>
+        <w:t xml:space="preserve">The system was exercised against a curated benchmark of 797 queries spanning all five difficulty bands, with the band populations kept roughly equal so that hard queries are deliberately over-represented relative to real traffic. Every query was routed, every routed tier produced answers from each cloud model it fronts, and every routed answer was scored by two independent LLM judges against gold reference answers from the frontier tier. The reporting below covers the cloud model results only. The rubric scored four dimensions on a one-to-four scale and assigned an overall verdict of Adequate, Marginal, or Failure.</w:t>
+      </w:r>
+    </w:p>
+    <w:p>
+      <w:pPr>
+        <w:pStyle w:val="Heading2"/>
+      </w:pPr>
+      <w:r>
+        <w:t xml:space="preserve">7.1 Where traffic went</w:t>
+      </w:r>
+    </w:p>
+    <w:p>
+      <w:pPr>
+        <w:spacing w:after="160" w:line="276"/>
+        <w:jc w:val="both"/>
+      </w:pPr>
+      <w:r>
+        <w:t xml:space="preserve">The router distributed the 797 queries across all five tiers. Because the benchmark over-weights hard queries, the upper tiers carry more traffic here than they would in production, where the easy tiers would dominate.</w:t>
+      </w:r>
+    </w:p>
+    <w:p>
+      <w:pPr>
+        <w:spacing w:after="40" w:before="80"/>
+        <w:jc w:val="center"/>
+      </w:pPr>
+      <w:r>
+        <w:drawing>
+          <wp:inline distT="0" distB="0" distL="0" distR="0">
+            <wp:extent cx="5715000" cy="2800350"/>
+            <wp:effectExtent t="0" r="0" b="0" l="0"/>
+            <wp:docPr id="1" name="fig_distribution.png" descr="Figure 7. Routing distribution across the 797-query benchmark. The flat-by-difficulty benchmark sends more traffic to the upper tiers than production traffic would." title="Figure 7. Routing distribution across the 797-query benchmark. The flat-by-difficulty benchmark sends more traffic to the upper tiers than production traffic would."/>
+            <wp:cNvGraphicFramePr>
+              <a:graphicFrameLocks xmlns:a="http://schemas.openxmlformats.org/drawingml/2006/main" noChangeAspect="1"/>
+            </wp:cNvGraphicFramePr>
+            <a:graphic xmlns:a="http://schemas.openxmlformats.org/drawingml/2006/main">
+              <a:graphicData uri="http://schemas.openxmlformats.org/drawingml/2006/picture">
+                <pic:pic xmlns:pic="http://schemas.openxmlformats.org/drawingml/2006/picture">
+                  <pic:nvPicPr>
+                    <pic:cNvPr id="0" name="" descr=""/>
+                    <pic:cNvPicPr>
+                      <a:picLocks noChangeAspect="1" noChangeArrowheads="1"/>
+                    </pic:cNvPicPr>
+                  </pic:nvPicPr>
+                  <pic:blipFill>
+                    <a:blip r:embed="rId14" cstate="none"/>
+                    <a:srcRect/>
+                    <a:stretch>
+                      <a:fillRect/>
+                    </a:stretch>
+                  </pic:blipFill>
+                  <pic:spPr bwMode="auto">
+                    <a:xfrm>
+                      <a:off x="0" y="0"/>
                       <a:ext cx="5715000" cy="2800350"/>
                     </a:xfrm>
                     <a:prstGeom prst="rect">
@@ -2392,7 +4872,96 @@
           <w:sz w:val="18"/>
           <w:szCs w:val="18"/>
         </w:rPr>
-        <w:t xml:space="preserve">Figure 6. Answer quality at the tier the router selected, cloud models only. Adequacy stays between 96 and 100 percent across tiers, so right-sizing does not cost quality.</w:t>
+        <w:t xml:space="preserve">Figure 7. Routing distribution across the 797-query benchmark. The flat-by-difficulty benchmark sends more traffic to the upper tiers than production traffic would.</w:t>
+      </w:r>
+    </w:p>
+    <w:p>
+      <w:pPr>
+        <w:pStyle w:val="Heading2"/>
+      </w:pPr>
+      <w:r>
+        <w:t xml:space="preserve">7.2 Whether the answers were good enough</w:t>
+      </w:r>
+    </w:p>
+    <w:p>
+      <w:pPr>
+        <w:spacing w:after="160" w:line="276"/>
+        <w:jc w:val="both"/>
+      </w:pPr>
+      <w:r>
+        <w:t xml:space="preserve">Across 6,268 answer-by-judge comparisons of routed cloud answers, </w:t>
+      </w:r>
+      <w:r>
+        <w:rPr>
+          <w:b/>
+          <w:bCs/>
+        </w:rPr>
+        <w:t xml:space="preserve">98 percent were judged Adequate</w:t>
+      </w:r>
+      <w:r>
+        <w:t xml:space="preserve">, under 2 percent Marginal, and under 1 percent Failure. Per-tier adequacy held between 96 and 100 percent, so the small tiers were not trading quality for cost: the cheapest T1 cloud models were judged adequate on essentially every query routed to them. Averaged across all routed answers, the judges scored correctness at 3.98 out of 4, completeness at 3.97, supporting-fact soundness at 3.98, and fitness for purpose at 3.58.</w:t>
+      </w:r>
+    </w:p>
+    <w:p>
+      <w:pPr>
+        <w:spacing w:after="40" w:before="80"/>
+        <w:jc w:val="center"/>
+      </w:pPr>
+      <w:r>
+        <w:drawing>
+          <wp:inline distT="0" distB="0" distL="0" distR="0">
+            <wp:extent cx="5715000" cy="2800350"/>
+            <wp:effectExtent t="0" r="0" b="0" l="0"/>
+            <wp:docPr id="1" name="fig_adequacy.png" descr="Figure 8. Answer quality at the tier the router selected, cloud models only. Adequacy stays between 96 and 100 percent across tiers, so right-sizing does not cost quality." title="Figure 8. Answer quality at the tier the router selected, cloud models only. Adequacy stays between 96 and 100 percent across tiers, so right-sizing does not cost quality."/>
+            <wp:cNvGraphicFramePr>
+              <a:graphicFrameLocks xmlns:a="http://schemas.openxmlformats.org/drawingml/2006/main" noChangeAspect="1"/>
+            </wp:cNvGraphicFramePr>
+            <a:graphic xmlns:a="http://schemas.openxmlformats.org/drawingml/2006/main">
+              <a:graphicData uri="http://schemas.openxmlformats.org/drawingml/2006/picture">
+                <pic:pic xmlns:pic="http://schemas.openxmlformats.org/drawingml/2006/picture">
+                  <pic:nvPicPr>
+                    <pic:cNvPr id="0" name="" descr=""/>
+                    <pic:cNvPicPr>
+                      <a:picLocks noChangeAspect="1" noChangeArrowheads="1"/>
+                    </pic:cNvPicPr>
+                  </pic:nvPicPr>
+                  <pic:blipFill>
+                    <a:blip r:embed="rId15" cstate="none"/>
+                    <a:srcRect/>
+                    <a:stretch>
+                      <a:fillRect/>
+                    </a:stretch>
+                  </pic:blipFill>
+                  <pic:spPr bwMode="auto">
+                    <a:xfrm>
+                      <a:off x="0" y="0"/>
+                      <a:ext cx="5715000" cy="2800350"/>
+                    </a:xfrm>
+                    <a:prstGeom prst="rect">
+                      <a:avLst/>
+                    </a:prstGeom>
+                  </pic:spPr>
+                </pic:pic>
+              </a:graphicData>
+            </a:graphic>
+          </wp:inline>
+        </w:drawing>
+      </w:r>
+    </w:p>
+    <w:p>
+      <w:pPr>
+        <w:spacing w:after="200"/>
+        <w:jc w:val="center"/>
+      </w:pPr>
+      <w:r>
+        <w:rPr>
+          <w:i/>
+          <w:iCs/>
+          <w:color w:val="46566b"/>
+          <w:sz w:val="18"/>
+          <w:szCs w:val="18"/>
+        </w:rPr>
+        <w:t xml:space="preserve">Figure 8. Answer quality at the tier the router selected, cloud models only. Adequacy stays between 96 and 100 percent across tiers, so right-sizing does not cost quality.</w:t>
       </w:r>
     </w:p>
     <w:p>
@@ -2502,6 +5071,7 @@
       </w:tblGrid>
       <w:tr>
         <w:trPr>
+          <w:cantSplit/>
           <w:tblHeader/>
         </w:trPr>
         <w:tc>
@@ -2606,6 +5176,7 @@
       </w:tr>
       <w:tr>
         <w:trPr>
+          <w:cantSplit/>
           <w:tblHeader w:val="false"/>
         </w:trPr>
         <w:tc>
@@ -2710,6 +5281,7 @@
       </w:tr>
       <w:tr>
         <w:trPr>
+          <w:cantSplit/>
           <w:tblHeader w:val="false"/>
         </w:trPr>
         <w:tc>
@@ -2814,6 +5386,7 @@
       </w:tr>
       <w:tr>
         <w:trPr>
+          <w:cantSplit/>
           <w:tblHeader w:val="false"/>
         </w:trPr>
         <w:tc>
@@ -2918,6 +5491,7 @@
       </w:tr>
       <w:tr>
         <w:trPr>
+          <w:cantSplit/>
           <w:tblHeader w:val="false"/>
         </w:trPr>
         <w:tc>
@@ -3022,6 +5596,7 @@
       </w:tr>
       <w:tr>
         <w:trPr>
+          <w:cantSplit/>
           <w:tblHeader w:val="false"/>
         </w:trPr>
         <w:tc>
@@ -3126,6 +5701,7 @@
       </w:tr>
       <w:tr>
         <w:trPr>
+          <w:cantSplit/>
           <w:tblHeader w:val="false"/>
         </w:trPr>
         <w:tc>
@@ -3230,6 +5806,7 @@
       </w:tr>
       <w:tr>
         <w:trPr>
+          <w:cantSplit/>
           <w:tblHeader w:val="false"/>
         </w:trPr>
         <w:tc>
@@ -3334,6 +5911,7 @@
       </w:tr>
       <w:tr>
         <w:trPr>
+          <w:cantSplit/>
           <w:tblHeader w:val="false"/>
         </w:trPr>
         <w:tc>
@@ -3503,6 +6081,7 @@
       </w:tblGrid>
       <w:tr>
         <w:trPr>
+          <w:cantSplit/>
           <w:tblHeader/>
         </w:trPr>
         <w:tc>
@@ -3574,6 +6153,7 @@
       </w:tr>
       <w:tr>
         <w:trPr>
+          <w:cantSplit/>
           <w:tblHeader w:val="false"/>
         </w:trPr>
         <w:tc>
@@ -3645,6 +6225,7 @@
       </w:tr>
       <w:tr>
         <w:trPr>
+          <w:cantSplit/>
           <w:tblHeader w:val="false"/>
         </w:trPr>
         <w:tc>
@@ -3716,6 +6297,7 @@
       </w:tr>
       <w:tr>
         <w:trPr>
+          <w:cantSplit/>
           <w:tblHeader w:val="false"/>
         </w:trPr>
         <w:tc>
@@ -3787,6 +6369,7 @@
       </w:tr>
       <w:tr>
         <w:trPr>
+          <w:cantSplit/>
           <w:tblHeader w:val="false"/>
         </w:trPr>
         <w:tc>
@@ -3858,6 +6441,7 @@
       </w:tr>
       <w:tr>
         <w:trPr>
+          <w:cantSplit/>
           <w:tblHeader w:val="false"/>
         </w:trPr>
         <w:tc>
@@ -3929,6 +6513,7 @@
       </w:tr>
       <w:tr>
         <w:trPr>
+          <w:cantSplit/>
           <w:tblHeader w:val="false"/>
         </w:trPr>
         <w:tc>
@@ -4000,6 +6585,7 @@
       </w:tr>
       <w:tr>
         <w:trPr>
+          <w:cantSplit/>
           <w:tblHeader w:val="false"/>
         </w:trPr>
         <w:tc>
@@ -4071,6 +6657,7 @@
       </w:tr>
       <w:tr>
         <w:trPr>
+          <w:cantSplit/>
           <w:tblHeader w:val="false"/>
         </w:trPr>
         <w:tc>
@@ -4142,6 +6729,7 @@
       </w:tr>
       <w:tr>
         <w:trPr>
+          <w:cantSplit/>
           <w:tblHeader w:val="false"/>
         </w:trPr>
         <w:tc>
@@ -4213,6 +6801,7 @@
       </w:tr>
       <w:tr>
         <w:trPr>
+          <w:cantSplit/>
           <w:tblHeader w:val="false"/>
         </w:trPr>
         <w:tc>
@@ -4284,6 +6873,7 @@
       </w:tr>
       <w:tr>
         <w:trPr>
+          <w:cantSplit/>
           <w:tblHeader w:val="false"/>
         </w:trPr>
         <w:tc>
@@ -4393,7 +6983,7 @@
       <w:r>
         <w:t xml:space="preserve">RouteLLM: Learning to Route LLMs with Preference Data (Ong et al., 2024). </w:t>
       </w:r>
-      <w:hyperlink w:history="1" r:id="rIdam9ouq8ksftx-bf00uehn">
+      <w:hyperlink w:history="1" r:id="rIdhofguvlufqlq38bh_hxcn">
         <w:r>
           <w:rPr>
             <w:rStyle w:val="Hyperlink"/>
@@ -4416,7 +7006,7 @@
       <w:r>
         <w:t xml:space="preserve">RouteLLM: An Open-Source Framework for Cost-Effective LLM Routing, LMSYS Blog (2024). </w:t>
       </w:r>
-      <w:hyperlink w:history="1" r:id="rIdgjldnlf6vmerqy69tnjh3">
+      <w:hyperlink w:history="1" r:id="rIdafxbwcerm_pnt-fbmln7x">
         <w:r>
           <w:rPr>
             <w:rStyle w:val="Hyperlink"/>
@@ -4439,7 +7029,7 @@
       <w:r>
         <w:t xml:space="preserve">Bringing intelligent, efficient routing to open source AI with vLLM Semantic Router, Red Hat (2025). </w:t>
       </w:r>
-      <w:hyperlink w:history="1" r:id="rIdptv06ftwfncylgnjnktdj">
+      <w:hyperlink w:history="1" r:id="rIdndgeykz8ragjrcz0m7job">
         <w:r>
           <w:rPr>
             <w:rStyle w:val="Hyperlink"/>
@@ -4462,7 +7052,7 @@
       <w:r>
         <w:t xml:space="preserve">vLLM Semantic Router: Next Phase in LLM inference, vLLM Blog (2025). </w:t>
       </w:r>
-      <w:hyperlink w:history="1" r:id="rIdqjddscdsmam4qepkiaa-u">
+      <w:hyperlink w:history="1" r:id="rId2lvpjqkngt3ugbxuezesr">
         <w:r>
           <w:rPr>
             <w:rStyle w:val="Hyperlink"/>
@@ -4485,7 +7075,7 @@
       <w:r>
         <w:t xml:space="preserve">When to Reason: Semantic Router for vLLM (2025). </w:t>
       </w:r>
-      <w:hyperlink w:history="1" r:id="rIdtwzfccggc7ual5bb4wtae">
+      <w:hyperlink w:history="1" r:id="rIdjxdhoharca2bjhq-gk3ve">
         <w:r>
           <w:rPr>
             <w:rStyle w:val="Hyperlink"/>
@@ -4508,7 +7098,7 @@
       <w:r>
         <w:t xml:space="preserve">Building an LLM Router for High-Quality and Cost-Effective Responses, Anyscale. </w:t>
       </w:r>
-      <w:hyperlink w:history="1" r:id="rIdm3mpnykxwq3g5ru0wsgax">
+      <w:hyperlink w:history="1" r:id="rIdfusi-fya8y_y5uwyzeq4t">
         <w:r>
           <w:rPr>
             <w:rStyle w:val="Hyperlink"/>
@@ -4761,6 +7351,18 @@
       </w:pPr>
     </w:lvl>
   </w:abstractNum>
+  <w:abstractNum w:abstractNumId="3" w15:restartNumberingAfterBreak="0">
+    <w:multiLevelType w:val="hybridMultilevel"/>
+    <w:lvl w:ilvl="0" w15:tentative="1">
+      <w:start w:val="1"/>
+      <w:numFmt w:val="decimal"/>
+      <w:lvlText w:val="%1."/>
+      <w:lvlJc w:val="left"/>
+      <w:pPr>
+        <w:ind w:left="600" w:hanging="340"/>
+      </w:pPr>
+    </w:lvl>
+  </w:abstractNum>
   <w:num w:numId="1">
     <w:abstractNumId w:val="1"/>
     <w:lvlOverride w:ilvl="0">
@@ -4769,6 +7371,12 @@
   </w:num>
   <w:num w:numId="2">
     <w:abstractNumId w:val="2"/>
+    <w:lvlOverride w:ilvl="0">
+      <w:startOverride w:val="1"/>
+    </w:lvlOverride>
+  </w:num>
+  <w:num w:numId="3">
+    <w:abstractNumId w:val="3"/>
     <w:lvlOverride w:ilvl="0">
       <w:startOverride w:val="1"/>
     </w:lvlOverride>

</xml_diff>